<commit_message>
chore: sync local changes
</commit_message>
<xml_diff>
--- a/00-首页/学生讲义Word/元素周期表与周期律-超级充实版（自学完整）.docx
+++ b/00-首页/学生讲义Word/元素周期表与周期律-超级充实版（自学完整）.docx
@@ -3574,7 +3574,7 @@
     </w:p>
     <w:p>
       <w:pPr>
-        <w:pStyle w:val="BodyText"/>
+        <w:pStyle w:val="BlockText"/>
       </w:pPr>
       <w:r>
         <w:rPr>
@@ -4086,19 +4086,18 @@
         <w:rPr>
           <w:b w:val="0"/>
           <w:i w:val="0"/>
-          <w:color w:val="1E40AF"/>
           <w:sz w:val="21"/>
         </w:rPr>
         <w:drawing>
           <wp:inline>
-            <wp:extent cx="3600000" cy="1923404"/>
+            <wp:extent cx="3600000" cy="1908749"/>
             <wp:effectExtent b="0" l="0" r="0" t="0"/>
             <wp:docPr descr="" title="" id="13" name="Picture"/>
             <a:graphic>
               <a:graphicData uri="http://schemas.openxmlformats.org/drawingml/2006/picture">
                 <pic:pic>
                   <pic:nvPicPr>
-                    <pic:cNvPr descr="media/effective_nuclear_charge.png" id="14" name="Picture"/>
+                    <pic:cNvPr descr="media/periodic_table_blocks.png" id="14" name="Picture"/>
                     <pic:cNvPicPr>
                       <a:picLocks noChangeArrowheads="1" noChangeAspect="1"/>
                     </pic:cNvPicPr>
@@ -4112,7 +4111,7 @@
                   <pic:spPr bwMode="auto">
                     <a:xfrm>
                       <a:off x="0" y="0"/>
-                      <a:ext cx="3600000" cy="1923404"/>
+                      <a:ext cx="3600000" cy="1908749"/>
                     </a:xfrm>
                     <a:prstGeom prst="rect">
                       <a:avLst/>
@@ -4134,7 +4133,6 @@
         <w:rPr>
           <w:b w:val="0"/>
           <w:i w:val="0"/>
-          <w:color w:val="1E40AF"/>
           <w:sz w:val="21"/>
         </w:rPr>
         <w:t xml:space="preserve"> </w:t>
@@ -4145,7 +4143,6 @@
           <w:b w:val="0"/>
           <w:i w:val="0"/>
           <w:iCs/>
-          <w:color w:val="1E40AF"/>
           <w:sz w:val="21"/>
         </w:rPr>
         <w:t xml:space="preserve">图</w:t>
@@ -4155,7 +4152,6 @@
           <w:b w:val="0"/>
           <w:i w:val="0"/>
           <w:iCs/>
-          <w:color w:val="1E40AF"/>
           <w:sz w:val="21"/>
         </w:rPr>
         <w:t xml:space="preserve"> </w:t>
@@ -4166,20 +4162,18 @@
           <w:b w:val="0"/>
           <w:i w:val="0"/>
           <w:iCs/>
-          <w:color w:val="1E40AF"/>
           <w:sz w:val="21"/>
         </w:rPr>
-        <w:t xml:space="preserve">周期表分区与价电子构型的对应关系——s区(第1-2列)、p区(第13-18列)、d区(第3-12列)、ds区(第11-12列)、f区(镧系+锕系)。注意</w:t>
+        <w:t xml:space="preserve">元素周期表分区与价电子构型的对应关系——s区(第1-2列，粉色)、p区(第13-18列，黄色)、d区(第3-12列，蓝色)、f区(镧系+锕系，绿色)。（Wikimedia</w:t>
       </w:r>
       <w:r>
         <w:rPr>
           <w:b w:val="0"/>
           <w:i w:val="0"/>
           <w:iCs/>
-          <w:color w:val="1E40AF"/>
           <w:sz w:val="21"/>
         </w:rPr>
-        <w:t xml:space="preserve"> ds </w:t>
+        <w:t xml:space="preserve"> Commons, CC </w:t>
       </w:r>
       <w:r>
         <w:rPr>
@@ -4187,52 +4181,9 @@
           <w:b w:val="0"/>
           <w:i w:val="0"/>
           <w:iCs/>
-          <w:color w:val="1E40AF"/>
           <w:sz w:val="21"/>
         </w:rPr>
-        <w:t xml:space="preserve">区是</w:t>
-      </w:r>
-      <w:r>
-        <w:rPr>
-          <w:b w:val="0"/>
-          <w:i w:val="0"/>
-          <w:iCs/>
-          <w:color w:val="1E40AF"/>
-          <w:sz w:val="21"/>
-        </w:rPr>
-        <w:t xml:space="preserve"> d </w:t>
-      </w:r>
-      <w:r>
-        <w:rPr>
-          <w:rFonts w:hint="eastAsia" w:eastAsia="FangSong" w:ascii="Times New Roman" w:hAnsi="Times New Roman"/>
-          <w:b w:val="0"/>
-          <w:i w:val="0"/>
-          <w:iCs/>
-          <w:color w:val="1E40AF"/>
-          <w:sz w:val="21"/>
-        </w:rPr>
-        <w:t xml:space="preserve">区的最右两列，d</w:t>
-      </w:r>
-      <w:r>
-        <w:rPr>
-          <w:b w:val="0"/>
-          <w:i w:val="0"/>
-          <w:iCs/>
-          <w:color w:val="1E40AF"/>
-          <w:sz w:val="21"/>
-        </w:rPr>
-        <w:t xml:space="preserve"> </w:t>
-      </w:r>
-      <w:r>
-        <w:rPr>
-          <w:rFonts w:hint="eastAsia" w:eastAsia="FangSong" w:ascii="Times New Roman" w:hAnsi="Times New Roman"/>
-          <w:b w:val="0"/>
-          <w:i w:val="0"/>
-          <w:iCs/>
-          <w:color w:val="1E40AF"/>
-          <w:sz w:val="21"/>
-        </w:rPr>
-        <w:t xml:space="preserve">轨道已全满。</w:t>
+        <w:t xml:space="preserve">BY-SA）</w:t>
       </w:r>
     </w:p>
     <w:p>
@@ -4944,7 +4895,7 @@
     </w:p>
     <w:p>
       <w:pPr>
-        <w:pStyle w:val="BodyText"/>
+        <w:pStyle w:val="BlockText"/>
       </w:pPr>
       <w:r>
         <w:rPr>
@@ -5017,7 +4968,7 @@
     </w:p>
     <w:p>
       <w:pPr>
-        <w:pStyle w:val="BodyText"/>
+        <w:pStyle w:val="FirstParagraph"/>
       </w:pPr>
       <w:r>
         <w:rPr>
@@ -5181,7 +5132,7 @@
     </w:p>
     <w:p>
       <w:pPr>
-        <w:pStyle w:val="BodyText"/>
+        <w:pStyle w:val="BlockText"/>
       </w:pPr>
       <w:r>
         <w:rPr>
@@ -5227,13 +5178,37 @@
         <w:t xml:space="preserve">的定量计算见</w:t>
       </w:r>
       <w:r>
-        <w:t xml:space="preserve"> Slater </w:t>
-      </w:r>
-      <w:r>
-        <w:rPr>
-          <w:rFonts w:hint="eastAsia" w:eastAsia="SimSun" w:ascii="Times New Roman" w:hAnsi="Times New Roman"/>
-        </w:rPr>
-        <w:t xml:space="preserve">规则（第二轮）。定性记住：</w:t>
+        <w:t xml:space="preserve"> </w:t>
+      </w:r>
+      <w:r>
+        <w:rPr>
+          <w:rFonts w:hint="eastAsia" w:eastAsia="SimSun" w:ascii="Times New Roman" w:hAnsi="Times New Roman"/>
+          <w:b/>
+          <w:bCs/>
+        </w:rPr>
+        <w:t xml:space="preserve">原子结构-超级充实版（自学完整）</w:t>
+      </w:r>
+      <w:r>
+        <w:rPr>
+          <w:b/>
+          <w:bCs/>
+        </w:rPr>
+        <w:t xml:space="preserve"> §2.3</w:t>
+      </w:r>
+      <w:r>
+        <w:rPr>
+          <w:rFonts w:hint="eastAsia" w:eastAsia="Times New Roman" w:ascii="Times New Roman" w:hAnsi="Times New Roman"/>
+        </w:rPr>
+        <w:t xml:space="preserve">（Slater</w:t>
+      </w:r>
+      <w:r>
+        <w:t xml:space="preserve"> </w:t>
+      </w:r>
+      <w:r>
+        <w:rPr>
+          <w:rFonts w:hint="eastAsia" w:eastAsia="SimSun" w:ascii="Times New Roman" w:hAnsi="Times New Roman"/>
+        </w:rPr>
+        <w:t xml:space="preserve">规则详细推导）。定性记住：</w:t>
       </w:r>
       <m:oMath>
         <m:oMathPr>
@@ -7518,7 +7493,7 @@
     </w:tbl>
     <w:p>
       <w:pPr>
-        <w:pStyle w:val="BodyText"/>
+        <w:pStyle w:val="BlockText"/>
         <w:spacing w:before="120"/>
       </w:pPr>
       <w:r>
@@ -7568,26 +7543,26 @@
     </w:p>
     <w:p>
       <w:pPr>
+        <w:pStyle w:val="BlockText"/>
+      </w:pPr>
+      <w:r>
+        <w:rPr>
+          <w:rFonts w:hint="eastAsia" w:eastAsia="SimSun" w:ascii="Times New Roman" w:hAnsi="Times New Roman"/>
+          <w:color w:val="1E40AF"/>
+        </w:rPr>
+        <w:t xml:space="preserve">课堂原话：</w:t>
+      </w:r>
+      <w:r>
+        <w:rPr>
+          <w:rFonts w:hint="eastAsia" w:eastAsia="SimSun" w:ascii="Times New Roman" w:hAnsi="Times New Roman"/>
+          <w:color w:val="1E40AF"/>
+        </w:rPr>
+        <w:t xml:space="preserve">“不要把周期律背成几个箭头——电离能的走势是’上台阶偶尔绊一下’，不是’上坡路’。”</w:t>
+      </w:r>
+    </w:p>
+    <w:p>
+      <w:pPr>
         <w:pStyle w:val="FirstParagraph"/>
-      </w:pPr>
-      <w:r>
-        <w:rPr>
-          <w:rFonts w:hint="eastAsia" w:eastAsia="SimSun" w:ascii="Times New Roman" w:hAnsi="Times New Roman"/>
-          <w:color w:val="1E40AF"/>
-        </w:rPr>
-        <w:t xml:space="preserve">课堂原话：</w:t>
-      </w:r>
-      <w:r>
-        <w:rPr>
-          <w:rFonts w:hint="eastAsia" w:eastAsia="SimSun" w:ascii="Times New Roman" w:hAnsi="Times New Roman"/>
-          <w:color w:val="1E40AF"/>
-        </w:rPr>
-        <w:t xml:space="preserve">“不要把周期律背成几个箭头——电离能的走势是’上台阶偶尔绊一下’，不是’上坡路’。”</w:t>
-      </w:r>
-    </w:p>
-    <w:p>
-      <w:pPr>
-        <w:pStyle w:val="BodyText"/>
         <w:spacing w:before="160" w:after="80"/>
         <w:jc w:val="center"/>
       </w:pPr>
@@ -7773,7 +7748,7 @@
     </w:p>
     <w:p>
       <w:pPr>
-        <w:pStyle w:val="BodyText"/>
+        <w:pStyle w:val="BlockText"/>
       </w:pPr>
       <w:r>
         <w:rPr>
@@ -9196,7 +9171,7 @@
     </w:tbl>
     <w:p>
       <w:pPr>
-        <w:pStyle w:val="BodyText"/>
+        <w:pStyle w:val="BlockText"/>
         <w:spacing w:before="120"/>
       </w:pPr>
       <w:r>
@@ -9996,7 +9971,7 @@
     </w:tbl>
     <w:p>
       <w:pPr>
-        <w:pStyle w:val="BodyText"/>
+        <w:pStyle w:val="BlockText"/>
         <w:spacing w:before="120"/>
       </w:pPr>
       <w:r>
@@ -10726,7 +10701,7 @@
     </w:p>
     <w:p>
       <w:pPr>
-        <w:pStyle w:val="BodyText"/>
+        <w:pStyle w:val="BlockText"/>
       </w:pPr>
       <w:r>
         <w:rPr>
@@ -10851,7 +10826,7 @@
     </w:p>
     <w:p>
       <w:pPr>
-        <w:pStyle w:val="BodyText"/>
+        <w:pStyle w:val="FirstParagraph"/>
       </w:pPr>
       <w:r>
         <w:rPr>
@@ -12380,7 +12355,7 @@
     </w:tbl>
     <w:p>
       <w:pPr>
-        <w:pStyle w:val="BodyText"/>
+        <w:pStyle w:val="BlockText"/>
         <w:spacing w:before="120"/>
       </w:pPr>
       <w:r>
@@ -12483,7 +12458,7 @@
     </w:p>
     <w:p>
       <w:pPr>
-        <w:pStyle w:val="BodyText"/>
+        <w:pStyle w:val="FirstParagraph"/>
       </w:pPr>
       <w:r>
         <w:rPr>
@@ -12603,7 +12578,7 @@
     </w:p>
     <w:p>
       <w:pPr>
-        <w:pStyle w:val="BodyText"/>
+        <w:pStyle w:val="BlockText"/>
       </w:pPr>
       <w:r>
         <w:rPr>
@@ -12867,7 +12842,7 @@
     </w:p>
     <w:p>
       <w:pPr>
-        <w:pStyle w:val="BodyText"/>
+        <w:pStyle w:val="BlockText"/>
       </w:pPr>
       <w:r>
         <w:rPr>
@@ -12940,7 +12915,7 @@
     </w:p>
     <w:p>
       <w:pPr>
-        <w:pStyle w:val="BodyText"/>
+        <w:pStyle w:val="FirstParagraph"/>
       </w:pPr>
       <w:r>
         <w:rPr>
@@ -13160,7 +13135,7 @@
     </w:p>
     <w:p>
       <w:pPr>
-        <w:pStyle w:val="BodyText"/>
+        <w:pStyle w:val="BlockText"/>
       </w:pPr>
       <w:r>
         <w:rPr>
@@ -13254,7 +13229,7 @@
     </w:p>
     <w:p>
       <w:pPr>
-        <w:pStyle w:val="BodyText"/>
+        <w:pStyle w:val="FirstParagraph"/>
       </w:pPr>
       <w:r>
         <w:rPr>
@@ -13575,7 +13550,7 @@
     </w:p>
     <w:p>
       <w:pPr>
-        <w:pStyle w:val="BodyText"/>
+        <w:pStyle w:val="BlockText"/>
       </w:pPr>
       <w:r>
         <w:rPr>
@@ -13635,7 +13610,7 @@
     </w:p>
     <w:p>
       <w:pPr>
-        <w:pStyle w:val="BodyText"/>
+        <w:pStyle w:val="FirstParagraph"/>
       </w:pPr>
       <w:r>
         <w:rPr>
@@ -14107,7 +14082,7 @@
     </w:tbl>
     <w:p>
       <w:pPr>
-        <w:pStyle w:val="BodyText"/>
+        <w:pStyle w:val="BlockText"/>
         <w:spacing w:before="120"/>
       </w:pPr>
       <w:r>
@@ -14220,7 +14195,7 @@
     </w:p>
     <w:p>
       <w:pPr>
-        <w:pStyle w:val="BodyText"/>
+        <w:pStyle w:val="FirstParagraph"/>
       </w:pPr>
       <w:r>
         <w:rPr>
@@ -14274,7 +14249,7 @@
     </w:p>
     <w:p>
       <w:pPr>
-        <w:pStyle w:val="FirstParagraph"/>
+        <w:pStyle w:val="BlockText"/>
       </w:pPr>
       <w:r>
         <w:rPr>
@@ -14367,7 +14342,7 @@
     </w:p>
     <w:p>
       <w:pPr>
-        <w:pStyle w:val="BodyText"/>
+        <w:pStyle w:val="BlockText"/>
       </w:pPr>
       <w:r>
         <w:rPr>
@@ -14423,7 +14398,7 @@
     </w:p>
     <w:p>
       <w:pPr>
-        <w:pStyle w:val="BodyText"/>
+        <w:pStyle w:val="BlockText"/>
       </w:pPr>
       <w:r>
         <w:rPr>
@@ -14461,7 +14436,7 @@
     </w:p>
     <w:p>
       <w:pPr>
-        <w:pStyle w:val="BodyText"/>
+        <w:pStyle w:val="BlockText"/>
       </w:pPr>
       <w:r>
         <w:rPr>
@@ -14535,7 +14510,7 @@
     </w:p>
     <w:p>
       <w:pPr>
-        <w:pStyle w:val="BodyText"/>
+        <w:pStyle w:val="BlockText"/>
       </w:pPr>
       <w:r>
         <w:rPr>
@@ -14609,7 +14584,7 @@
     </w:p>
     <w:p>
       <w:pPr>
-        <w:pStyle w:val="BodyText"/>
+        <w:pStyle w:val="BlockText"/>
       </w:pPr>
       <w:r>
         <w:rPr>
@@ -14731,7 +14706,7 @@
     </w:p>
     <w:p>
       <w:pPr>
-        <w:pStyle w:val="BodyText"/>
+        <w:pStyle w:val="BlockText"/>
       </w:pPr>
       <w:r>
         <w:rPr>
@@ -14891,9 +14866,6 @@
           <w:rFonts w:hint="eastAsia" w:eastAsia="SimHei" w:ascii="Times New Roman" w:hAnsi="Times New Roman"/>
         </w:rPr>
         <w:t xml:space="preserve">[周期律趋势判断]</w:t>
-      </w:r>
-      <w:r>
-        <w:t xml:space="preserve"> ⭐⭐</w:t>
       </w:r>
     </w:p>
     <w:p>
@@ -15426,9 +15398,6 @@
         </w:rPr>
         <w:t xml:space="preserve">[电离能反常解释]</w:t>
       </w:r>
-      <w:r>
-        <w:t xml:space="preserve"> ⭐⭐⭐</w:t>
-      </w:r>
     </w:p>
     <w:p>
       <w:pPr>
@@ -15935,9 +15904,6 @@
           <w:rFonts w:hint="eastAsia" w:eastAsia="SimHei" w:ascii="Times New Roman" w:hAnsi="Times New Roman"/>
         </w:rPr>
         <w:t xml:space="preserve">[电离能突变推断族属]</w:t>
-      </w:r>
-      <w:r>
-        <w:t xml:space="preserve"> ⭐⭐⭐</w:t>
       </w:r>
     </w:p>
     <w:p>
@@ -16894,9 +16860,6 @@
         </w:rPr>
         <w:t xml:space="preserve">[元素分区判断]</w:t>
       </w:r>
-      <w:r>
-        <w:t xml:space="preserve"> ⭐⭐</w:t>
-      </w:r>
     </w:p>
     <w:p>
       <w:pPr>
@@ -17383,12 +17346,6 @@
           <w:color w:val="1E40AF"/>
         </w:rPr>
         <w:t xml:space="preserve">[镧系收缩应用]</w:t>
-      </w:r>
-      <w:r>
-        <w:rPr>
-          <w:color w:val="1E40AF"/>
-        </w:rPr>
-        <w:t xml:space="preserve"> ⭐⭐⭐</w:t>
       </w:r>
     </w:p>
     <w:p>
@@ -17681,12 +17638,6 @@
           <w:color w:val="1E40AF"/>
         </w:rPr>
         <w:t xml:space="preserve">[惰性电子对效应应用]</w:t>
-      </w:r>
-      <w:r>
-        <w:rPr>
-          <w:color w:val="1E40AF"/>
-        </w:rPr>
-        <w:t xml:space="preserve"> ⭐⭐⭐⭐</w:t>
       </w:r>
     </w:p>
     <w:p>
@@ -20331,7 +20282,7 @@
         <w:rPr>
           <w:rFonts w:hint="eastAsia" w:eastAsia="SimHei" w:ascii="Times New Roman" w:hAnsi="Times New Roman"/>
         </w:rPr>
-        <w:t xml:space="preserve">基础巩固（⭐）</w:t>
+        <w:t xml:space="preserve">基础巩固（）</w:t>
       </w:r>
     </w:p>
     <w:p>
@@ -20361,7 +20312,7 @@
       <w:pPr>
         <w:pStyle w:val="Compact"/>
         <w:numPr>
-          <w:ilvl w:val="1"/>
+          <w:ilvl w:val="0"/>
           <w:numId w:val="1013"/>
         </w:numPr>
       </w:pPr>
@@ -20410,7 +20361,7 @@
         <w:pStyle w:val="Compact"/>
         <w:numPr>
           <w:ilvl w:val="0"/>
-          <w:numId w:val="1012"/>
+          <w:numId w:val="1014"/>
         </w:numPr>
       </w:pPr>
       <w:r>
@@ -20426,154 +20377,6 @@
           <w:rFonts w:hint="eastAsia" w:eastAsia="Times New Roman" w:ascii="Times New Roman" w:hAnsi="Times New Roman"/>
         </w:rPr>
         <w:t xml:space="preserve">：</w:t>
-      </w:r>
-    </w:p>
-    <w:p>
-      <w:pPr>
-        <w:pStyle w:val="Compact"/>
-        <w:numPr>
-          <w:ilvl w:val="1"/>
-          <w:numId w:val="1014"/>
-        </w:numPr>
-      </w:pPr>
-      <w:r>
-        <w:t xml:space="preserve">Na </w:t>
-      </w:r>
-      <w:r>
-        <w:rPr>
-          <w:rFonts w:hint="eastAsia" w:eastAsia="SimSun" w:ascii="Times New Roman" w:hAnsi="Times New Roman"/>
-        </w:rPr>
-        <w:t xml:space="preserve">和</w:t>
-      </w:r>
-      <w:r>
-        <w:t xml:space="preserve"> Mg </w:t>
-      </w:r>
-      <w:r>
-        <w:rPr>
-          <w:rFonts w:hint="eastAsia" w:eastAsia="SimSun" w:ascii="Times New Roman" w:hAnsi="Times New Roman"/>
-        </w:rPr>
-        <w:t xml:space="preserve">的原子半径</w:t>
-      </w:r>
-    </w:p>
-    <w:p>
-      <w:pPr>
-        <w:pStyle w:val="Compact"/>
-        <w:numPr>
-          <w:ilvl w:val="1"/>
-          <w:numId w:val="1014"/>
-        </w:numPr>
-      </w:pPr>
-      <w:r>
-        <w:t xml:space="preserve">Na⁺ </w:t>
-      </w:r>
-      <w:r>
-        <w:rPr>
-          <w:rFonts w:hint="eastAsia" w:eastAsia="SimSun" w:ascii="Times New Roman" w:hAnsi="Times New Roman"/>
-        </w:rPr>
-        <w:t xml:space="preserve">和</w:t>
-      </w:r>
-      <w:r>
-        <w:t xml:space="preserve"> Mg²⁺ </w:t>
-      </w:r>
-      <w:r>
-        <w:rPr>
-          <w:rFonts w:hint="eastAsia" w:eastAsia="SimSun" w:ascii="Times New Roman" w:hAnsi="Times New Roman"/>
-        </w:rPr>
-        <w:t xml:space="preserve">的离子半径</w:t>
-      </w:r>
-    </w:p>
-    <w:p>
-      <w:pPr>
-        <w:pStyle w:val="Compact"/>
-        <w:numPr>
-          <w:ilvl w:val="1"/>
-          <w:numId w:val="1014"/>
-        </w:numPr>
-      </w:pPr>
-      <w:r>
-        <w:t xml:space="preserve">Cl⁻ </w:t>
-      </w:r>
-      <w:r>
-        <w:rPr>
-          <w:rFonts w:hint="eastAsia" w:eastAsia="SimSun" w:ascii="Times New Roman" w:hAnsi="Times New Roman"/>
-        </w:rPr>
-        <w:t xml:space="preserve">和</w:t>
-      </w:r>
-      <w:r>
-        <w:t xml:space="preserve"> S²⁻ </w:t>
-      </w:r>
-      <w:r>
-        <w:rPr>
-          <w:rFonts w:hint="eastAsia" w:eastAsia="SimSun" w:ascii="Times New Roman" w:hAnsi="Times New Roman"/>
-        </w:rPr>
-        <w:t xml:space="preserve">的离子半径</w:t>
-      </w:r>
-    </w:p>
-    <w:p>
-      <w:pPr>
-        <w:pStyle w:val="Compact"/>
-        <w:numPr>
-          <w:ilvl w:val="1"/>
-          <w:numId w:val="1014"/>
-        </w:numPr>
-      </w:pPr>
-      <w:r>
-        <w:t xml:space="preserve">F </w:t>
-      </w:r>
-      <w:r>
-        <w:rPr>
-          <w:rFonts w:hint="eastAsia" w:eastAsia="SimSun" w:ascii="Times New Roman" w:hAnsi="Times New Roman"/>
-        </w:rPr>
-        <w:t xml:space="preserve">和</w:t>
-      </w:r>
-      <w:r>
-        <w:t xml:space="preserve"> Cl </w:t>
-      </w:r>
-      <w:r>
-        <w:rPr>
-          <w:rFonts w:hint="eastAsia" w:eastAsia="SimSun" w:ascii="Times New Roman" w:hAnsi="Times New Roman"/>
-        </w:rPr>
-        <w:t xml:space="preserve">的电负性</w:t>
-      </w:r>
-    </w:p>
-    <w:p>
-      <w:pPr>
-        <w:pStyle w:val="Compact"/>
-        <w:numPr>
-          <w:ilvl w:val="0"/>
-          <w:numId w:val="1012"/>
-        </w:numPr>
-      </w:pPr>
-      <w:r>
-        <w:rPr>
-          <w:rFonts w:hint="eastAsia" w:eastAsia="SimSun" w:ascii="Times New Roman" w:hAnsi="Times New Roman"/>
-          <w:b/>
-          <w:bCs/>
-        </w:rPr>
-        <w:t xml:space="preserve">将以下元素按第一电离能从大到小排序</w:t>
-      </w:r>
-      <w:r>
-        <w:rPr>
-          <w:rFonts w:hint="eastAsia" w:eastAsia="Times New Roman" w:ascii="Times New Roman" w:hAnsi="Times New Roman"/>
-        </w:rPr>
-        <w:t xml:space="preserve">：Na、Mg、Al、Si、P、S、Cl。</w:t>
-      </w:r>
-    </w:p>
-    <w:bookmarkEnd w:id="55"/>
-    <w:bookmarkStart w:id="56" w:name="提高训练"/>
-    <w:p>
-      <w:pPr>
-        <w:pStyle w:val="Heading3"/>
-        <w:spacing w:before="280" w:after="120"/>
-      </w:pPr>
-      <w:r>
-        <w:t xml:space="preserve">7.2 </w:t>
-      </w:r>
-      <w:r>
-        <w:rPr>
-          <w:rFonts w:hint="eastAsia" w:eastAsia="SimHei" w:ascii="Times New Roman" w:hAnsi="Times New Roman"/>
-        </w:rPr>
-        <w:t xml:space="preserve">提高训练（⭐⭐⭐）</w:t>
       </w:r>
     </w:p>
     <w:p>
@@ -20585,33 +20388,13 @@
         </w:numPr>
       </w:pPr>
       <w:r>
-        <w:rPr>
-          <w:rFonts w:hint="eastAsia" w:eastAsia="SimSun" w:ascii="Times New Roman" w:hAnsi="Times New Roman"/>
-          <w:b/>
-          <w:bCs/>
-        </w:rPr>
-        <w:t xml:space="preserve">反常解释</w:t>
-      </w:r>
-      <w:r>
-        <w:rPr>
-          <w:rFonts w:hint="eastAsia" w:eastAsia="Times New Roman" w:ascii="Times New Roman" w:hAnsi="Times New Roman"/>
-        </w:rPr>
-        <w:t xml:space="preserve">：</w:t>
-      </w:r>
-    </w:p>
-    <w:p>
-      <w:pPr>
-        <w:pStyle w:val="Compact"/>
-        <w:numPr>
-          <w:ilvl w:val="1"/>
-          <w:numId w:val="1016"/>
-        </w:numPr>
-      </w:pPr>
-      <w:r>
-        <w:rPr>
-          <w:rFonts w:hint="eastAsia" w:eastAsia="SimSun" w:ascii="Times New Roman" w:hAnsi="Times New Roman"/>
-        </w:rPr>
-        <w:t xml:space="preserve">解释为什么</w:t>
+        <w:t xml:space="preserve">Na </w:t>
+      </w:r>
+      <w:r>
+        <w:rPr>
+          <w:rFonts w:hint="eastAsia" w:eastAsia="SimSun" w:ascii="Times New Roman" w:hAnsi="Times New Roman"/>
+        </w:rPr>
+        <w:t xml:space="preserve">和</w:t>
       </w:r>
       <w:r>
         <w:t xml:space="preserve"> Mg </w:t>
@@ -20620,82 +20403,7 @@
         <w:rPr>
           <w:rFonts w:hint="eastAsia" w:eastAsia="SimSun" w:ascii="Times New Roman" w:hAnsi="Times New Roman"/>
         </w:rPr>
-        <w:t xml:space="preserve">的第一电离能大于</w:t>
-      </w:r>
-      <w:r>
-        <w:t xml:space="preserve"> Al。</w:t>
-      </w:r>
-    </w:p>
-    <w:p>
-      <w:pPr>
-        <w:pStyle w:val="Compact"/>
-        <w:numPr>
-          <w:ilvl w:val="1"/>
-          <w:numId w:val="1016"/>
-        </w:numPr>
-      </w:pPr>
-      <w:r>
-        <w:rPr>
-          <w:rFonts w:hint="eastAsia" w:eastAsia="SimSun" w:ascii="Times New Roman" w:hAnsi="Times New Roman"/>
-        </w:rPr>
-        <w:t xml:space="preserve">解释为什么</w:t>
-      </w:r>
-      <w:r>
-        <w:t xml:space="preserve"> P </w:t>
-      </w:r>
-      <w:r>
-        <w:rPr>
-          <w:rFonts w:hint="eastAsia" w:eastAsia="SimSun" w:ascii="Times New Roman" w:hAnsi="Times New Roman"/>
-        </w:rPr>
-        <w:t xml:space="preserve">的第一电离能大于</w:t>
-      </w:r>
-      <w:r>
-        <w:t xml:space="preserve"> S。</w:t>
-      </w:r>
-    </w:p>
-    <w:p>
-      <w:pPr>
-        <w:pStyle w:val="Compact"/>
-        <w:numPr>
-          <w:ilvl w:val="1"/>
-          <w:numId w:val="1016"/>
-        </w:numPr>
-      </w:pPr>
-      <w:r>
-        <w:rPr>
-          <w:rFonts w:hint="eastAsia" w:eastAsia="SimSun" w:ascii="Times New Roman" w:hAnsi="Times New Roman"/>
-        </w:rPr>
-        <w:t xml:space="preserve">解释为什么</w:t>
-      </w:r>
-      <w:r>
-        <w:t xml:space="preserve"> F </w:t>
-      </w:r>
-      <w:r>
-        <w:rPr>
-          <w:rFonts w:hint="eastAsia" w:eastAsia="SimSun" w:ascii="Times New Roman" w:hAnsi="Times New Roman"/>
-        </w:rPr>
-        <w:t xml:space="preserve">的电负性大于</w:t>
-      </w:r>
-      <w:r>
-        <w:t xml:space="preserve"> </w:t>
-      </w:r>
-      <w:r>
-        <w:rPr>
-          <w:rFonts w:hint="eastAsia" w:eastAsia="SimSun" w:ascii="Times New Roman" w:hAnsi="Times New Roman"/>
-        </w:rPr>
-        <w:t xml:space="preserve">Cl，但电子亲和能</w:t>
-      </w:r>
-      <w:r>
-        <w:t xml:space="preserve"> Cl </w:t>
-      </w:r>
-      <w:r>
-        <w:rPr>
-          <w:rFonts w:hint="eastAsia" w:eastAsia="SimSun" w:ascii="Times New Roman" w:hAnsi="Times New Roman"/>
-        </w:rPr>
-        <w:t xml:space="preserve">大于</w:t>
-      </w:r>
-      <w:r>
-        <w:t xml:space="preserve"> F。</w:t>
+        <w:t xml:space="preserve">的原子半径</w:t>
       </w:r>
     </w:p>
     <w:p>
@@ -20704,6 +20412,249 @@
         <w:numPr>
           <w:ilvl w:val="0"/>
           <w:numId w:val="1015"/>
+        </w:numPr>
+      </w:pPr>
+      <w:r>
+        <w:t xml:space="preserve">Na⁺ </w:t>
+      </w:r>
+      <w:r>
+        <w:rPr>
+          <w:rFonts w:hint="eastAsia" w:eastAsia="SimSun" w:ascii="Times New Roman" w:hAnsi="Times New Roman"/>
+        </w:rPr>
+        <w:t xml:space="preserve">和</w:t>
+      </w:r>
+      <w:r>
+        <w:t xml:space="preserve"> Mg²⁺ </w:t>
+      </w:r>
+      <w:r>
+        <w:rPr>
+          <w:rFonts w:hint="eastAsia" w:eastAsia="SimSun" w:ascii="Times New Roman" w:hAnsi="Times New Roman"/>
+        </w:rPr>
+        <w:t xml:space="preserve">的离子半径</w:t>
+      </w:r>
+    </w:p>
+    <w:p>
+      <w:pPr>
+        <w:pStyle w:val="Compact"/>
+        <w:numPr>
+          <w:ilvl w:val="0"/>
+          <w:numId w:val="1015"/>
+        </w:numPr>
+      </w:pPr>
+      <w:r>
+        <w:t xml:space="preserve">Cl⁻ </w:t>
+      </w:r>
+      <w:r>
+        <w:rPr>
+          <w:rFonts w:hint="eastAsia" w:eastAsia="SimSun" w:ascii="Times New Roman" w:hAnsi="Times New Roman"/>
+        </w:rPr>
+        <w:t xml:space="preserve">和</w:t>
+      </w:r>
+      <w:r>
+        <w:t xml:space="preserve"> S²⁻ </w:t>
+      </w:r>
+      <w:r>
+        <w:rPr>
+          <w:rFonts w:hint="eastAsia" w:eastAsia="SimSun" w:ascii="Times New Roman" w:hAnsi="Times New Roman"/>
+        </w:rPr>
+        <w:t xml:space="preserve">的离子半径</w:t>
+      </w:r>
+    </w:p>
+    <w:p>
+      <w:pPr>
+        <w:pStyle w:val="Compact"/>
+        <w:numPr>
+          <w:ilvl w:val="0"/>
+          <w:numId w:val="1015"/>
+        </w:numPr>
+      </w:pPr>
+      <w:r>
+        <w:t xml:space="preserve">F </w:t>
+      </w:r>
+      <w:r>
+        <w:rPr>
+          <w:rFonts w:hint="eastAsia" w:eastAsia="SimSun" w:ascii="Times New Roman" w:hAnsi="Times New Roman"/>
+        </w:rPr>
+        <w:t xml:space="preserve">和</w:t>
+      </w:r>
+      <w:r>
+        <w:t xml:space="preserve"> Cl </w:t>
+      </w:r>
+      <w:r>
+        <w:rPr>
+          <w:rFonts w:hint="eastAsia" w:eastAsia="SimSun" w:ascii="Times New Roman" w:hAnsi="Times New Roman"/>
+        </w:rPr>
+        <w:t xml:space="preserve">的电负性</w:t>
+      </w:r>
+    </w:p>
+    <w:p>
+      <w:pPr>
+        <w:pStyle w:val="Compact"/>
+        <w:numPr>
+          <w:ilvl w:val="0"/>
+          <w:numId w:val="1016"/>
+        </w:numPr>
+      </w:pPr>
+      <w:r>
+        <w:rPr>
+          <w:rFonts w:hint="eastAsia" w:eastAsia="SimSun" w:ascii="Times New Roman" w:hAnsi="Times New Roman"/>
+          <w:b/>
+          <w:bCs/>
+        </w:rPr>
+        <w:t xml:space="preserve">将以下元素按第一电离能从大到小排序</w:t>
+      </w:r>
+      <w:r>
+        <w:rPr>
+          <w:rFonts w:hint="eastAsia" w:eastAsia="Times New Roman" w:ascii="Times New Roman" w:hAnsi="Times New Roman"/>
+        </w:rPr>
+        <w:t xml:space="preserve">：Na、Mg、Al、Si、P、S、Cl。</w:t>
+      </w:r>
+    </w:p>
+    <w:bookmarkEnd w:id="55"/>
+    <w:bookmarkStart w:id="56" w:name="提高训练"/>
+    <w:p>
+      <w:pPr>
+        <w:pStyle w:val="Heading3"/>
+        <w:spacing w:before="280" w:after="120"/>
+      </w:pPr>
+      <w:r>
+        <w:t xml:space="preserve">7.2 </w:t>
+      </w:r>
+      <w:r>
+        <w:rPr>
+          <w:rFonts w:hint="eastAsia" w:eastAsia="SimHei" w:ascii="Times New Roman" w:hAnsi="Times New Roman"/>
+        </w:rPr>
+        <w:t xml:space="preserve">提高训练（）</w:t>
+      </w:r>
+    </w:p>
+    <w:p>
+      <w:pPr>
+        <w:pStyle w:val="Compact"/>
+        <w:numPr>
+          <w:ilvl w:val="0"/>
+          <w:numId w:val="1017"/>
+        </w:numPr>
+      </w:pPr>
+      <w:r>
+        <w:rPr>
+          <w:rFonts w:hint="eastAsia" w:eastAsia="SimSun" w:ascii="Times New Roman" w:hAnsi="Times New Roman"/>
+          <w:b/>
+          <w:bCs/>
+        </w:rPr>
+        <w:t xml:space="preserve">反常解释</w:t>
+      </w:r>
+      <w:r>
+        <w:rPr>
+          <w:rFonts w:hint="eastAsia" w:eastAsia="Times New Roman" w:ascii="Times New Roman" w:hAnsi="Times New Roman"/>
+        </w:rPr>
+        <w:t xml:space="preserve">：</w:t>
+      </w:r>
+    </w:p>
+    <w:p>
+      <w:pPr>
+        <w:pStyle w:val="Compact"/>
+        <w:numPr>
+          <w:ilvl w:val="0"/>
+          <w:numId w:val="1018"/>
+        </w:numPr>
+      </w:pPr>
+      <w:r>
+        <w:rPr>
+          <w:rFonts w:hint="eastAsia" w:eastAsia="SimSun" w:ascii="Times New Roman" w:hAnsi="Times New Roman"/>
+        </w:rPr>
+        <w:t xml:space="preserve">解释为什么</w:t>
+      </w:r>
+      <w:r>
+        <w:t xml:space="preserve"> Mg </w:t>
+      </w:r>
+      <w:r>
+        <w:rPr>
+          <w:rFonts w:hint="eastAsia" w:eastAsia="SimSun" w:ascii="Times New Roman" w:hAnsi="Times New Roman"/>
+        </w:rPr>
+        <w:t xml:space="preserve">的第一电离能大于</w:t>
+      </w:r>
+      <w:r>
+        <w:t xml:space="preserve"> Al。</w:t>
+      </w:r>
+    </w:p>
+    <w:p>
+      <w:pPr>
+        <w:pStyle w:val="Compact"/>
+        <w:numPr>
+          <w:ilvl w:val="0"/>
+          <w:numId w:val="1018"/>
+        </w:numPr>
+      </w:pPr>
+      <w:r>
+        <w:rPr>
+          <w:rFonts w:hint="eastAsia" w:eastAsia="SimSun" w:ascii="Times New Roman" w:hAnsi="Times New Roman"/>
+        </w:rPr>
+        <w:t xml:space="preserve">解释为什么</w:t>
+      </w:r>
+      <w:r>
+        <w:t xml:space="preserve"> P </w:t>
+      </w:r>
+      <w:r>
+        <w:rPr>
+          <w:rFonts w:hint="eastAsia" w:eastAsia="SimSun" w:ascii="Times New Roman" w:hAnsi="Times New Roman"/>
+        </w:rPr>
+        <w:t xml:space="preserve">的第一电离能大于</w:t>
+      </w:r>
+      <w:r>
+        <w:t xml:space="preserve"> S。</w:t>
+      </w:r>
+    </w:p>
+    <w:p>
+      <w:pPr>
+        <w:pStyle w:val="Compact"/>
+        <w:numPr>
+          <w:ilvl w:val="0"/>
+          <w:numId w:val="1018"/>
+        </w:numPr>
+      </w:pPr>
+      <w:r>
+        <w:rPr>
+          <w:rFonts w:hint="eastAsia" w:eastAsia="SimSun" w:ascii="Times New Roman" w:hAnsi="Times New Roman"/>
+        </w:rPr>
+        <w:t xml:space="preserve">解释为什么</w:t>
+      </w:r>
+      <w:r>
+        <w:t xml:space="preserve"> F </w:t>
+      </w:r>
+      <w:r>
+        <w:rPr>
+          <w:rFonts w:hint="eastAsia" w:eastAsia="SimSun" w:ascii="Times New Roman" w:hAnsi="Times New Roman"/>
+        </w:rPr>
+        <w:t xml:space="preserve">的电负性大于</w:t>
+      </w:r>
+      <w:r>
+        <w:t xml:space="preserve"> </w:t>
+      </w:r>
+      <w:r>
+        <w:rPr>
+          <w:rFonts w:hint="eastAsia" w:eastAsia="SimSun" w:ascii="Times New Roman" w:hAnsi="Times New Roman"/>
+        </w:rPr>
+        <w:t xml:space="preserve">Cl，但电子亲和能</w:t>
+      </w:r>
+      <w:r>
+        <w:t xml:space="preserve"> Cl </w:t>
+      </w:r>
+      <w:r>
+        <w:rPr>
+          <w:rFonts w:hint="eastAsia" w:eastAsia="SimSun" w:ascii="Times New Roman" w:hAnsi="Times New Roman"/>
+        </w:rPr>
+        <w:t xml:space="preserve">大于</w:t>
+      </w:r>
+      <w:r>
+        <w:t xml:space="preserve"> F。</w:t>
+      </w:r>
+    </w:p>
+    <w:p>
+      <w:pPr>
+        <w:pStyle w:val="Compact"/>
+        <w:numPr>
+          <w:ilvl w:val="0"/>
+          <w:numId w:val="1019"/>
         </w:numPr>
       </w:pPr>
       <w:r>
@@ -20937,8 +20888,8 @@
       <w:pPr>
         <w:pStyle w:val="Compact"/>
         <w:numPr>
-          <w:ilvl w:val="1"/>
-          <w:numId w:val="1017"/>
+          <w:ilvl w:val="0"/>
+          <w:numId w:val="1020"/>
         </w:numPr>
       </w:pPr>
       <w:r>
@@ -20946,36 +20897,6 @@
           <w:rFonts w:hint="eastAsia" w:eastAsia="SimSun" w:ascii="Times New Roman" w:hAnsi="Times New Roman"/>
         </w:rPr>
         <w:t xml:space="preserve">判断该元素有几个价电子，位于第几族。</w:t>
-      </w:r>
-    </w:p>
-    <w:p>
-      <w:pPr>
-        <w:pStyle w:val="Compact"/>
-        <w:numPr>
-          <w:ilvl w:val="1"/>
-          <w:numId w:val="1017"/>
-        </w:numPr>
-      </w:pPr>
-      <w:r>
-        <w:rPr>
-          <w:rFonts w:hint="eastAsia" w:eastAsia="SimSun" w:ascii="Times New Roman" w:hAnsi="Times New Roman"/>
-        </w:rPr>
-        <w:t xml:space="preserve">若该元素为第三周期元素，写出其元素符号和电子排布式。</w:t>
-      </w:r>
-    </w:p>
-    <w:p>
-      <w:pPr>
-        <w:pStyle w:val="Compact"/>
-        <w:numPr>
-          <w:ilvl w:val="1"/>
-          <w:numId w:val="1017"/>
-        </w:numPr>
-      </w:pPr>
-      <w:r>
-        <w:rPr>
-          <w:rFonts w:hint="eastAsia" w:eastAsia="SimSun" w:ascii="Times New Roman" w:hAnsi="Times New Roman"/>
-        </w:rPr>
-        <w:t xml:space="preserve">写出该元素最高价氧化物的水化物化学式，判断其酸碱性。</w:t>
       </w:r>
     </w:p>
     <w:p>
@@ -20983,7 +20904,37 @@
         <w:pStyle w:val="Compact"/>
         <w:numPr>
           <w:ilvl w:val="0"/>
-          <w:numId w:val="1015"/>
+          <w:numId w:val="1020"/>
+        </w:numPr>
+      </w:pPr>
+      <w:r>
+        <w:rPr>
+          <w:rFonts w:hint="eastAsia" w:eastAsia="SimSun" w:ascii="Times New Roman" w:hAnsi="Times New Roman"/>
+        </w:rPr>
+        <w:t xml:space="preserve">若该元素为第三周期元素，写出其元素符号和电子排布式。</w:t>
+      </w:r>
+    </w:p>
+    <w:p>
+      <w:pPr>
+        <w:pStyle w:val="Compact"/>
+        <w:numPr>
+          <w:ilvl w:val="0"/>
+          <w:numId w:val="1020"/>
+        </w:numPr>
+      </w:pPr>
+      <w:r>
+        <w:rPr>
+          <w:rFonts w:hint="eastAsia" w:eastAsia="SimSun" w:ascii="Times New Roman" w:hAnsi="Times New Roman"/>
+        </w:rPr>
+        <w:t xml:space="preserve">写出该元素最高价氧化物的水化物化学式，判断其酸碱性。</w:t>
+      </w:r>
+    </w:p>
+    <w:p>
+      <w:pPr>
+        <w:pStyle w:val="Compact"/>
+        <w:numPr>
+          <w:ilvl w:val="0"/>
+          <w:numId w:val="1021"/>
         </w:numPr>
       </w:pPr>
       <w:r>
@@ -21121,587 +21072,7 @@
         <w:rPr>
           <w:rFonts w:hint="eastAsia" w:eastAsia="SimHei" w:ascii="Times New Roman" w:hAnsi="Times New Roman"/>
         </w:rPr>
-        <w:t xml:space="preserve">挑战题（⭐⭐⭐⭐⭐）</w:t>
-      </w:r>
-    </w:p>
-    <w:p>
-      <w:pPr>
-        <w:numPr>
-          <w:ilvl w:val="0"/>
-          <w:numId w:val="1018"/>
-        </w:numPr>
-      </w:pPr>
-      <w:r>
-        <w:rPr>
-          <w:rFonts w:hint="eastAsia" w:eastAsia="SimSun" w:ascii="Times New Roman" w:hAnsi="Times New Roman"/>
-          <w:b/>
-          <w:bCs/>
-        </w:rPr>
-        <w:t xml:space="preserve">综合推断</w:t>
-      </w:r>
-      <w:r>
-        <w:rPr>
-          <w:rFonts w:hint="eastAsia" w:eastAsia="Times New Roman" w:ascii="Times New Roman" w:hAnsi="Times New Roman"/>
-        </w:rPr>
-        <w:t xml:space="preserve">：A、B、C、D</w:t>
-      </w:r>
-      <w:r>
-        <w:t xml:space="preserve"> </w:t>
-      </w:r>
-      <w:r>
-        <w:rPr>
-          <w:rFonts w:hint="eastAsia" w:eastAsia="SimSun" w:ascii="Times New Roman" w:hAnsi="Times New Roman"/>
-        </w:rPr>
-        <w:t xml:space="preserve">为四种短周期元素。已知：</w:t>
-      </w:r>
-    </w:p>
-    <w:p>
-      <w:pPr>
-        <w:pStyle w:val="Compact"/>
-        <w:numPr>
-          <w:ilvl w:val="1"/>
-          <w:numId w:val="1019"/>
-        </w:numPr>
-      </w:pPr>
-      <w:r>
-        <w:t xml:space="preserve">A </w:t>
-      </w:r>
-      <w:r>
-        <w:rPr>
-          <w:rFonts w:hint="eastAsia" w:eastAsia="SimSun" w:ascii="Times New Roman" w:hAnsi="Times New Roman"/>
-        </w:rPr>
-        <w:t xml:space="preserve">的简单阴离子与</w:t>
-      </w:r>
-      <w:r>
-        <w:t xml:space="preserve"> D </w:t>
-      </w:r>
-      <w:r>
-        <w:rPr>
-          <w:rFonts w:hint="eastAsia" w:eastAsia="SimSun" w:ascii="Times New Roman" w:hAnsi="Times New Roman"/>
-        </w:rPr>
-        <w:t xml:space="preserve">的简单阳离子具有相同的电子层结构</w:t>
-      </w:r>
-    </w:p>
-    <w:p>
-      <w:pPr>
-        <w:pStyle w:val="Compact"/>
-        <w:numPr>
-          <w:ilvl w:val="1"/>
-          <w:numId w:val="1019"/>
-        </w:numPr>
-      </w:pPr>
-      <w:r>
-        <w:t xml:space="preserve">B </w:t>
-      </w:r>
-      <w:r>
-        <w:rPr>
-          <w:rFonts w:hint="eastAsia" w:eastAsia="SimSun" w:ascii="Times New Roman" w:hAnsi="Times New Roman"/>
-        </w:rPr>
-        <w:t xml:space="preserve">的最高价氧化物对应水化物与</w:t>
-      </w:r>
-      <w:r>
-        <w:t xml:space="preserve"> D </w:t>
-      </w:r>
-      <w:r>
-        <w:rPr>
-          <w:rFonts w:hint="eastAsia" w:eastAsia="SimSun" w:ascii="Times New Roman" w:hAnsi="Times New Roman"/>
-        </w:rPr>
-        <w:t xml:space="preserve">的最高价氧化物对应水化物反应生成盐和水</w:t>
-      </w:r>
-    </w:p>
-    <w:p>
-      <w:pPr>
-        <w:pStyle w:val="Compact"/>
-        <w:numPr>
-          <w:ilvl w:val="1"/>
-          <w:numId w:val="1019"/>
-        </w:numPr>
-      </w:pPr>
-      <w:r>
-        <w:t xml:space="preserve">C </w:t>
-      </w:r>
-      <w:r>
-        <w:rPr>
-          <w:rFonts w:hint="eastAsia" w:eastAsia="SimSun" w:ascii="Times New Roman" w:hAnsi="Times New Roman"/>
-        </w:rPr>
-        <w:t xml:space="preserve">的单质既能与强酸反应又能与强碱反应</w:t>
-      </w:r>
-    </w:p>
-    <w:p>
-      <w:pPr>
-        <w:pStyle w:val="Compact"/>
-        <w:numPr>
-          <w:ilvl w:val="1"/>
-          <w:numId w:val="1019"/>
-        </w:numPr>
-      </w:pPr>
-      <w:r>
-        <w:t xml:space="preserve">A </w:t>
-      </w:r>
-      <w:r>
-        <w:rPr>
-          <w:rFonts w:hint="eastAsia" w:eastAsia="SimSun" w:ascii="Times New Roman" w:hAnsi="Times New Roman"/>
-        </w:rPr>
-        <w:t xml:space="preserve">的第一电离能在同周期元素中仅低于稀有气体</w:t>
-      </w:r>
-    </w:p>
-    <w:p>
-      <w:pPr>
-        <w:numPr>
-          <w:ilvl w:val="0"/>
-          <w:numId w:val="1000"/>
-        </w:numPr>
-      </w:pPr>
-      <w:r>
-        <w:rPr>
-          <w:rFonts w:hint="eastAsia" w:eastAsia="SimSun" w:ascii="Times New Roman" w:hAnsi="Times New Roman"/>
-        </w:rPr>
-        <w:t xml:space="preserve">请推断</w:t>
-      </w:r>
-      <w:r>
-        <w:t xml:space="preserve"> A、B、C、D </w:t>
-      </w:r>
-      <w:r>
-        <w:rPr>
-          <w:rFonts w:hint="eastAsia" w:eastAsia="SimSun" w:ascii="Times New Roman" w:hAnsi="Times New Roman"/>
-        </w:rPr>
-        <w:t xml:space="preserve">的元素符号，并说明推理过程。</w:t>
-      </w:r>
-    </w:p>
-    <w:p>
-      <w:pPr>
-        <w:numPr>
-          <w:ilvl w:val="0"/>
-          <w:numId w:val="1018"/>
-        </w:numPr>
-      </w:pPr>
-      <w:r>
-        <w:rPr>
-          <w:rFonts w:hint="eastAsia" w:eastAsia="SimSun" w:ascii="Times New Roman" w:hAnsi="Times New Roman"/>
-          <w:b/>
-          <w:bCs/>
-        </w:rPr>
-        <w:t xml:space="preserve">周期律综合分析</w:t>
-      </w:r>
-      <w:r>
-        <w:rPr>
-          <w:rFonts w:hint="eastAsia" w:eastAsia="Times New Roman" w:ascii="Times New Roman" w:hAnsi="Times New Roman"/>
-        </w:rPr>
-        <w:t xml:space="preserve">：X、Y、Z、W</w:t>
-      </w:r>
-      <w:r>
-        <w:t xml:space="preserve"> </w:t>
-      </w:r>
-      <w:r>
-        <w:rPr>
-          <w:rFonts w:hint="eastAsia" w:eastAsia="SimSun" w:ascii="Times New Roman" w:hAnsi="Times New Roman"/>
-        </w:rPr>
-        <w:t xml:space="preserve">是原子序数依次增大的短周期元素。已知：</w:t>
-      </w:r>
-    </w:p>
-    <w:p>
-      <w:pPr>
-        <w:pStyle w:val="Compact"/>
-        <w:numPr>
-          <w:ilvl w:val="1"/>
-          <w:numId w:val="1020"/>
-        </w:numPr>
-      </w:pPr>
-      <w:r>
-        <w:t xml:space="preserve">X </w:t>
-      </w:r>
-      <w:r>
-        <w:rPr>
-          <w:rFonts w:hint="eastAsia" w:eastAsia="SimSun" w:ascii="Times New Roman" w:hAnsi="Times New Roman"/>
-        </w:rPr>
-        <w:t xml:space="preserve">的原子半径在同周期中最小</w:t>
-      </w:r>
-    </w:p>
-    <w:p>
-      <w:pPr>
-        <w:pStyle w:val="Compact"/>
-        <w:numPr>
-          <w:ilvl w:val="1"/>
-          <w:numId w:val="1020"/>
-        </w:numPr>
-      </w:pPr>
-      <w:r>
-        <w:t xml:space="preserve">Y </w:t>
-      </w:r>
-      <w:r>
-        <w:rPr>
-          <w:rFonts w:hint="eastAsia" w:eastAsia="SimSun" w:ascii="Times New Roman" w:hAnsi="Times New Roman"/>
-        </w:rPr>
-        <w:t xml:space="preserve">的简单离子与</w:t>
-      </w:r>
-      <w:r>
-        <w:t xml:space="preserve"> W </w:t>
-      </w:r>
-      <w:r>
-        <w:rPr>
-          <w:rFonts w:hint="eastAsia" w:eastAsia="SimSun" w:ascii="Times New Roman" w:hAnsi="Times New Roman"/>
-        </w:rPr>
-        <w:t xml:space="preserve">的简单离子具有相同的电子层结构</w:t>
-      </w:r>
-    </w:p>
-    <w:p>
-      <w:pPr>
-        <w:pStyle w:val="Compact"/>
-        <w:numPr>
-          <w:ilvl w:val="1"/>
-          <w:numId w:val="1020"/>
-        </w:numPr>
-      </w:pPr>
-      <w:r>
-        <w:t xml:space="preserve">Z </w:t>
-      </w:r>
-      <w:r>
-        <w:rPr>
-          <w:rFonts w:hint="eastAsia" w:eastAsia="SimSun" w:ascii="Times New Roman" w:hAnsi="Times New Roman"/>
-        </w:rPr>
-        <w:t xml:space="preserve">的第一电离能在其同周期元素中最小</w:t>
-      </w:r>
-    </w:p>
-    <w:p>
-      <w:pPr>
-        <w:pStyle w:val="Compact"/>
-        <w:numPr>
-          <w:ilvl w:val="1"/>
-          <w:numId w:val="1020"/>
-        </w:numPr>
-      </w:pPr>
-      <w:r>
-        <w:t xml:space="preserve">W </w:t>
-      </w:r>
-      <w:r>
-        <w:rPr>
-          <w:rFonts w:hint="eastAsia" w:eastAsia="SimSun" w:ascii="Times New Roman" w:hAnsi="Times New Roman"/>
-        </w:rPr>
-        <w:t xml:space="preserve">的氧化物对应水化物为强酸</w:t>
-      </w:r>
-    </w:p>
-    <w:p>
-      <w:pPr>
-        <w:numPr>
-          <w:ilvl w:val="0"/>
-          <w:numId w:val="1000"/>
-        </w:numPr>
-      </w:pPr>
-      <w:r>
-        <w:rPr>
-          <w:rFonts w:hint="eastAsia" w:eastAsia="SimSun" w:ascii="Times New Roman" w:hAnsi="Times New Roman"/>
-        </w:rPr>
-        <w:t xml:space="preserve">回答：(1)</w:t>
-      </w:r>
-      <w:r>
-        <w:t xml:space="preserve"> </w:t>
-      </w:r>
-      <w:r>
-        <w:rPr>
-          <w:rFonts w:hint="eastAsia" w:eastAsia="SimSun" w:ascii="Times New Roman" w:hAnsi="Times New Roman"/>
-        </w:rPr>
-        <w:t xml:space="preserve">写出</w:t>
-      </w:r>
-      <w:r>
-        <w:t xml:space="preserve"> X、Y、Z、W </w:t>
-      </w:r>
-      <w:r>
-        <w:rPr>
-          <w:rFonts w:hint="eastAsia" w:eastAsia="SimSun" w:ascii="Times New Roman" w:hAnsi="Times New Roman"/>
-        </w:rPr>
-        <w:t xml:space="preserve">的元素符号；(2)</w:t>
-      </w:r>
-      <w:r>
-        <w:t xml:space="preserve"> </w:t>
-      </w:r>
-      <w:r>
-        <w:rPr>
-          <w:rFonts w:hint="eastAsia" w:eastAsia="SimSun" w:ascii="Times New Roman" w:hAnsi="Times New Roman"/>
-        </w:rPr>
-        <w:t xml:space="preserve">比较</w:t>
-      </w:r>
-      <w:r>
-        <w:t xml:space="preserve"> X、Y、Z </w:t>
-      </w:r>
-      <w:r>
-        <w:rPr>
-          <w:rFonts w:hint="eastAsia" w:eastAsia="SimSun" w:ascii="Times New Roman" w:hAnsi="Times New Roman"/>
-        </w:rPr>
-        <w:t xml:space="preserve">的原子半径大小；(3)</w:t>
-      </w:r>
-      <w:r>
-        <w:t xml:space="preserve"> </w:t>
-      </w:r>
-      <w:r>
-        <w:rPr>
-          <w:rFonts w:hint="eastAsia" w:eastAsia="SimSun" w:ascii="Times New Roman" w:hAnsi="Times New Roman"/>
-        </w:rPr>
-        <w:t xml:space="preserve">比较</w:t>
-      </w:r>
-      <w:r>
-        <w:t xml:space="preserve"> Y </w:t>
-      </w:r>
-      <w:r>
-        <w:rPr>
-          <w:rFonts w:hint="eastAsia" w:eastAsia="SimSun" w:ascii="Times New Roman" w:hAnsi="Times New Roman"/>
-        </w:rPr>
-        <w:t xml:space="preserve">和</w:t>
-      </w:r>
-      <w:r>
-        <w:t xml:space="preserve"> W </w:t>
-      </w:r>
-      <w:r>
-        <w:rPr>
-          <w:rFonts w:hint="eastAsia" w:eastAsia="SimSun" w:ascii="Times New Roman" w:hAnsi="Times New Roman"/>
-        </w:rPr>
-        <w:t xml:space="preserve">的简单离子的半径大小；(4)</w:t>
-      </w:r>
-      <w:r>
-        <w:t xml:space="preserve"> </w:t>
-      </w:r>
-      <w:r>
-        <w:rPr>
-          <w:rFonts w:hint="eastAsia" w:eastAsia="SimSun" w:ascii="Times New Roman" w:hAnsi="Times New Roman"/>
-        </w:rPr>
-        <w:t xml:space="preserve">写出</w:t>
-      </w:r>
-      <w:r>
-        <w:t xml:space="preserve"> X </w:t>
-      </w:r>
-      <w:r>
-        <w:rPr>
-          <w:rFonts w:hint="eastAsia" w:eastAsia="SimSun" w:ascii="Times New Roman" w:hAnsi="Times New Roman"/>
-        </w:rPr>
-        <w:t xml:space="preserve">和</w:t>
-      </w:r>
-      <w:r>
-        <w:t xml:space="preserve"> Z </w:t>
-      </w:r>
-      <w:r>
-        <w:rPr>
-          <w:rFonts w:hint="eastAsia" w:eastAsia="SimSun" w:ascii="Times New Roman" w:hAnsi="Times New Roman"/>
-        </w:rPr>
-        <w:t xml:space="preserve">形成的化合物的化学式并判断键型。</w:t>
-      </w:r>
-    </w:p>
-    <w:p>
-      <w:pPr>
-        <w:numPr>
-          <w:ilvl w:val="0"/>
-          <w:numId w:val="1018"/>
-        </w:numPr>
-      </w:pPr>
-      <w:r>
-        <w:rPr>
-          <w:rFonts w:hint="eastAsia" w:eastAsia="SimSun" w:ascii="Times New Roman" w:hAnsi="Times New Roman"/>
-          <w:b/>
-          <w:bCs/>
-        </w:rPr>
-        <w:t xml:space="preserve">惰性电子对效应解释</w:t>
-      </w:r>
-      <w:r>
-        <w:rPr>
-          <w:rFonts w:hint="eastAsia" w:eastAsia="SimSun" w:ascii="Times New Roman" w:hAnsi="Times New Roman"/>
-        </w:rPr>
-        <w:t xml:space="preserve">（🏆）：已知</w:t>
-      </w:r>
-      <w:r>
-        <w:t xml:space="preserve"> Tl </w:t>
-      </w:r>
-      <w:r>
-        <w:rPr>
-          <w:rFonts w:hint="eastAsia" w:eastAsia="SimSun" w:ascii="Times New Roman" w:hAnsi="Times New Roman"/>
-        </w:rPr>
-        <w:t xml:space="preserve">在第六周期ⅢA</w:t>
-      </w:r>
-      <w:r>
-        <w:t xml:space="preserve"> </w:t>
-      </w:r>
-      <w:r>
-        <w:rPr>
-          <w:rFonts w:hint="eastAsia" w:eastAsia="SimSun" w:ascii="Times New Roman" w:hAnsi="Times New Roman"/>
-        </w:rPr>
-        <w:t xml:space="preserve">族，其常见氧化态为</w:t>
-      </w:r>
-      <w:r>
-        <w:t xml:space="preserve"> Tl(Ⅰ) </w:t>
-      </w:r>
-      <w:r>
-        <w:rPr>
-          <w:rFonts w:hint="eastAsia" w:eastAsia="SimSun" w:ascii="Times New Roman" w:hAnsi="Times New Roman"/>
-        </w:rPr>
-        <w:t xml:space="preserve">和</w:t>
-      </w:r>
-      <w:r>
-        <w:t xml:space="preserve"> </w:t>
-      </w:r>
-      <w:r>
-        <w:rPr>
-          <w:rFonts w:hint="eastAsia" w:eastAsia="SimSun" w:ascii="Times New Roman" w:hAnsi="Times New Roman"/>
-        </w:rPr>
-        <w:t xml:space="preserve">Tl(Ⅲ)，且</w:t>
-      </w:r>
-      <w:r>
-        <w:t xml:space="preserve"> Tl(Ⅰ) </w:t>
-      </w:r>
-      <w:r>
-        <w:rPr>
-          <w:rFonts w:hint="eastAsia" w:eastAsia="SimSun" w:ascii="Times New Roman" w:hAnsi="Times New Roman"/>
-        </w:rPr>
-        <w:t xml:space="preserve">比</w:t>
-      </w:r>
-      <w:r>
-        <w:t xml:space="preserve"> Tl(Ⅲ) </w:t>
-      </w:r>
-      <w:r>
-        <w:rPr>
-          <w:rFonts w:hint="eastAsia" w:eastAsia="SimSun" w:ascii="Times New Roman" w:hAnsi="Times New Roman"/>
-        </w:rPr>
-        <w:t xml:space="preserve">更稳定。请回答：</w:t>
-      </w:r>
-    </w:p>
-    <w:p>
-      <w:pPr>
-        <w:pStyle w:val="Compact"/>
-        <w:numPr>
-          <w:ilvl w:val="1"/>
-          <w:numId w:val="1021"/>
-        </w:numPr>
-      </w:pPr>
-      <w:r>
-        <w:rPr>
-          <w:rFonts w:hint="eastAsia" w:eastAsia="SimSun" w:ascii="Times New Roman" w:hAnsi="Times New Roman"/>
-        </w:rPr>
-        <w:t xml:space="preserve">这一现象叫什么？从电子结构角度解释原因。</w:t>
-      </w:r>
-    </w:p>
-    <w:p>
-      <w:pPr>
-        <w:pStyle w:val="Compact"/>
-        <w:numPr>
-          <w:ilvl w:val="1"/>
-          <w:numId w:val="1021"/>
-        </w:numPr>
-      </w:pPr>
-      <w:r>
-        <w:rPr>
-          <w:rFonts w:hint="eastAsia" w:eastAsia="SimSun" w:ascii="Times New Roman" w:hAnsi="Times New Roman"/>
-        </w:rPr>
-        <w:t xml:space="preserve">对比</w:t>
-      </w:r>
-      <w:r>
-        <w:t xml:space="preserve"> </w:t>
-      </w:r>
-      <w:r>
-        <w:rPr>
-          <w:rFonts w:hint="eastAsia" w:eastAsia="SimSun" w:ascii="Times New Roman" w:hAnsi="Times New Roman"/>
-        </w:rPr>
-        <w:t xml:space="preserve">Al（第三周期ⅢA</w:t>
-      </w:r>
-      <w:r>
-        <w:t xml:space="preserve"> </w:t>
-      </w:r>
-      <w:r>
-        <w:rPr>
-          <w:rFonts w:hint="eastAsia" w:eastAsia="SimSun" w:ascii="Times New Roman" w:hAnsi="Times New Roman"/>
-        </w:rPr>
-        <w:t xml:space="preserve">族）的常见氧化态，说明为什么同为ⅢA</w:t>
-      </w:r>
-      <w:r>
-        <w:t xml:space="preserve"> </w:t>
-      </w:r>
-      <w:r>
-        <w:rPr>
-          <w:rFonts w:hint="eastAsia" w:eastAsia="SimSun" w:ascii="Times New Roman" w:hAnsi="Times New Roman"/>
-        </w:rPr>
-        <w:t xml:space="preserve">族，趋势却不同。</w:t>
-      </w:r>
-    </w:p>
-    <w:p>
-      <w:pPr>
-        <w:pStyle w:val="Compact"/>
-        <w:numPr>
-          <w:ilvl w:val="1"/>
-          <w:numId w:val="1021"/>
-        </w:numPr>
-      </w:pPr>
-      <w:r>
-        <w:rPr>
-          <w:rFonts w:hint="eastAsia" w:eastAsia="SimSun" w:ascii="Times New Roman" w:hAnsi="Times New Roman"/>
-        </w:rPr>
-        <w:t xml:space="preserve">预测</w:t>
-      </w:r>
-      <w:r>
-        <w:t xml:space="preserve"> </w:t>
-      </w:r>
-      <w:r>
-        <w:rPr>
-          <w:rFonts w:hint="eastAsia" w:eastAsia="SimSun" w:ascii="Times New Roman" w:hAnsi="Times New Roman"/>
-        </w:rPr>
-        <w:t xml:space="preserve">In（第五周期ⅢA</w:t>
-      </w:r>
-      <w:r>
-        <w:t xml:space="preserve"> </w:t>
-      </w:r>
-      <w:r>
-        <w:rPr>
-          <w:rFonts w:hint="eastAsia" w:eastAsia="SimSun" w:ascii="Times New Roman" w:hAnsi="Times New Roman"/>
-        </w:rPr>
-        <w:t xml:space="preserve">族）的</w:t>
-      </w:r>
-      <w:r>
-        <w:t xml:space="preserve"> Tl(Ⅰ)/Tl(Ⅲ) </w:t>
-      </w:r>
-      <w:r>
-        <w:rPr>
-          <w:rFonts w:hint="eastAsia" w:eastAsia="SimSun" w:ascii="Times New Roman" w:hAnsi="Times New Roman"/>
-        </w:rPr>
-        <w:t xml:space="preserve">稳定性关系，说明理由。</w:t>
-      </w:r>
-    </w:p>
-    <w:p>
-      <w:pPr>
-        <w:spacing w:before="160" w:after="80"/>
-      </w:pPr>
-      <w:r>
-        <w:pict>
-          <v:rect style="width:0;height:1.5pt" o:hralign="center" o:hrstd="t" o:hr="t"/>
-        </w:pict>
-      </w:r>
-    </w:p>
-    <w:bookmarkEnd w:id="57"/>
-    <w:bookmarkEnd w:id="58"/>
-    <w:bookmarkStart w:id="59" w:name="八参考答案与提示"/>
-    <w:p>
-      <w:pPr>
-        <w:pStyle w:val="Heading2"/>
-        <w:spacing w:before="280" w:after="120"/>
-      </w:pPr>
-      <w:r>
-        <w:rPr>
-          <w:rFonts w:hint="eastAsia" w:eastAsia="SimHei" w:ascii="Times New Roman" w:hAnsi="Times New Roman"/>
-        </w:rPr>
-        <w:t xml:space="preserve">八、参考答案与提示</w:t>
-      </w:r>
-    </w:p>
-    <w:p>
-      <w:pPr>
-        <w:pStyle w:val="FirstParagraph"/>
-      </w:pPr>
-      <w:r>
-        <w:rPr>
-          <w:b/>
-          <w:bCs/>
-        </w:rPr>
-        <w:t xml:space="preserve">7.1 </w:t>
-      </w:r>
-      <w:r>
-        <w:rPr>
-          <w:rFonts w:hint="eastAsia" w:eastAsia="SimSun" w:ascii="Times New Roman" w:hAnsi="Times New Roman"/>
-          <w:b/>
-          <w:bCs/>
-        </w:rPr>
-        <w:t xml:space="preserve">基础巩固</w:t>
+        <w:t xml:space="preserve">挑战题（）</w:t>
       </w:r>
     </w:p>
     <w:p>
@@ -21712,13 +21083,590 @@
           <w:numId w:val="1022"/>
         </w:numPr>
       </w:pPr>
+      <w:r>
+        <w:rPr>
+          <w:rFonts w:hint="eastAsia" w:eastAsia="SimSun" w:ascii="Times New Roman" w:hAnsi="Times New Roman"/>
+          <w:b/>
+          <w:bCs/>
+        </w:rPr>
+        <w:t xml:space="preserve">综合推断</w:t>
+      </w:r>
+      <w:r>
+        <w:rPr>
+          <w:rFonts w:hint="eastAsia" w:eastAsia="Times New Roman" w:ascii="Times New Roman" w:hAnsi="Times New Roman"/>
+        </w:rPr>
+        <w:t xml:space="preserve">：A、B、C、D</w:t>
+      </w:r>
+      <w:r>
+        <w:t xml:space="preserve"> </w:t>
+      </w:r>
+      <w:r>
+        <w:rPr>
+          <w:rFonts w:hint="eastAsia" w:eastAsia="SimSun" w:ascii="Times New Roman" w:hAnsi="Times New Roman"/>
+        </w:rPr>
+        <w:t xml:space="preserve">为四种短周期元素。已知：</w:t>
+      </w:r>
+    </w:p>
+    <w:p>
+      <w:pPr>
+        <w:pStyle w:val="Compact"/>
+        <w:numPr>
+          <w:ilvl w:val="0"/>
+          <w:numId w:val="1023"/>
+        </w:numPr>
+      </w:pPr>
+      <w:r>
+        <w:t xml:space="preserve">A </w:t>
+      </w:r>
+      <w:r>
+        <w:rPr>
+          <w:rFonts w:hint="eastAsia" w:eastAsia="SimSun" w:ascii="Times New Roman" w:hAnsi="Times New Roman"/>
+        </w:rPr>
+        <w:t xml:space="preserve">的简单阴离子与</w:t>
+      </w:r>
+      <w:r>
+        <w:t xml:space="preserve"> D </w:t>
+      </w:r>
+      <w:r>
+        <w:rPr>
+          <w:rFonts w:hint="eastAsia" w:eastAsia="SimSun" w:ascii="Times New Roman" w:hAnsi="Times New Roman"/>
+        </w:rPr>
+        <w:t xml:space="preserve">的简单阳离子具有相同的电子层结构</w:t>
+      </w:r>
+    </w:p>
+    <w:p>
+      <w:pPr>
+        <w:pStyle w:val="Compact"/>
+        <w:numPr>
+          <w:ilvl w:val="0"/>
+          <w:numId w:val="1023"/>
+        </w:numPr>
+      </w:pPr>
+      <w:r>
+        <w:t xml:space="preserve">B </w:t>
+      </w:r>
+      <w:r>
+        <w:rPr>
+          <w:rFonts w:hint="eastAsia" w:eastAsia="SimSun" w:ascii="Times New Roman" w:hAnsi="Times New Roman"/>
+        </w:rPr>
+        <w:t xml:space="preserve">的最高价氧化物对应水化物与</w:t>
+      </w:r>
+      <w:r>
+        <w:t xml:space="preserve"> D </w:t>
+      </w:r>
+      <w:r>
+        <w:rPr>
+          <w:rFonts w:hint="eastAsia" w:eastAsia="SimSun" w:ascii="Times New Roman" w:hAnsi="Times New Roman"/>
+        </w:rPr>
+        <w:t xml:space="preserve">的最高价氧化物对应水化物反应生成盐和水</w:t>
+      </w:r>
+    </w:p>
+    <w:p>
+      <w:pPr>
+        <w:pStyle w:val="Compact"/>
+        <w:numPr>
+          <w:ilvl w:val="0"/>
+          <w:numId w:val="1023"/>
+        </w:numPr>
+      </w:pPr>
+      <w:r>
+        <w:t xml:space="preserve">C </w:t>
+      </w:r>
+      <w:r>
+        <w:rPr>
+          <w:rFonts w:hint="eastAsia" w:eastAsia="SimSun" w:ascii="Times New Roman" w:hAnsi="Times New Roman"/>
+        </w:rPr>
+        <w:t xml:space="preserve">的单质既能与强酸反应又能与强碱反应</w:t>
+      </w:r>
+    </w:p>
+    <w:p>
+      <w:pPr>
+        <w:pStyle w:val="Compact"/>
+        <w:numPr>
+          <w:ilvl w:val="0"/>
+          <w:numId w:val="1023"/>
+        </w:numPr>
+      </w:pPr>
+      <w:r>
+        <w:t xml:space="preserve">A </w:t>
+      </w:r>
+      <w:r>
+        <w:rPr>
+          <w:rFonts w:hint="eastAsia" w:eastAsia="SimSun" w:ascii="Times New Roman" w:hAnsi="Times New Roman"/>
+        </w:rPr>
+        <w:t xml:space="preserve">的第一电离能在同周期元素中仅低于稀有气体</w:t>
+      </w:r>
+    </w:p>
+    <w:p>
+      <w:pPr>
+        <w:pStyle w:val="FirstParagraph"/>
+      </w:pPr>
+      <w:r>
+        <w:rPr>
+          <w:rFonts w:hint="eastAsia" w:eastAsia="SimSun" w:ascii="Times New Roman" w:hAnsi="Times New Roman"/>
+        </w:rPr>
+        <w:t xml:space="preserve">请推断</w:t>
+      </w:r>
+      <w:r>
+        <w:t xml:space="preserve"> A、B、C、D </w:t>
+      </w:r>
+      <w:r>
+        <w:rPr>
+          <w:rFonts w:hint="eastAsia" w:eastAsia="SimSun" w:ascii="Times New Roman" w:hAnsi="Times New Roman"/>
+        </w:rPr>
+        <w:t xml:space="preserve">的元素符号，并说明推理过程。</w:t>
+      </w:r>
+    </w:p>
+    <w:p>
+      <w:pPr>
+        <w:pStyle w:val="Compact"/>
+        <w:numPr>
+          <w:ilvl w:val="0"/>
+          <w:numId w:val="1024"/>
+        </w:numPr>
+      </w:pPr>
+      <w:r>
+        <w:rPr>
+          <w:rFonts w:hint="eastAsia" w:eastAsia="SimSun" w:ascii="Times New Roman" w:hAnsi="Times New Roman"/>
+          <w:b/>
+          <w:bCs/>
+        </w:rPr>
+        <w:t xml:space="preserve">周期律综合分析</w:t>
+      </w:r>
+      <w:r>
+        <w:rPr>
+          <w:rFonts w:hint="eastAsia" w:eastAsia="Times New Roman" w:ascii="Times New Roman" w:hAnsi="Times New Roman"/>
+        </w:rPr>
+        <w:t xml:space="preserve">：X、Y、Z、W</w:t>
+      </w:r>
+      <w:r>
+        <w:t xml:space="preserve"> </w:t>
+      </w:r>
+      <w:r>
+        <w:rPr>
+          <w:rFonts w:hint="eastAsia" w:eastAsia="SimSun" w:ascii="Times New Roman" w:hAnsi="Times New Roman"/>
+        </w:rPr>
+        <w:t xml:space="preserve">是原子序数依次增大的短周期元素。已知：</w:t>
+      </w:r>
+    </w:p>
+    <w:p>
+      <w:pPr>
+        <w:pStyle w:val="Compact"/>
+        <w:numPr>
+          <w:ilvl w:val="0"/>
+          <w:numId w:val="1025"/>
+        </w:numPr>
+      </w:pPr>
+      <w:r>
+        <w:t xml:space="preserve">X </w:t>
+      </w:r>
+      <w:r>
+        <w:rPr>
+          <w:rFonts w:hint="eastAsia" w:eastAsia="SimSun" w:ascii="Times New Roman" w:hAnsi="Times New Roman"/>
+        </w:rPr>
+        <w:t xml:space="preserve">的原子半径在同周期中最小</w:t>
+      </w:r>
+    </w:p>
+    <w:p>
+      <w:pPr>
+        <w:pStyle w:val="Compact"/>
+        <w:numPr>
+          <w:ilvl w:val="0"/>
+          <w:numId w:val="1025"/>
+        </w:numPr>
+      </w:pPr>
+      <w:r>
+        <w:t xml:space="preserve">Y </w:t>
+      </w:r>
+      <w:r>
+        <w:rPr>
+          <w:rFonts w:hint="eastAsia" w:eastAsia="SimSun" w:ascii="Times New Roman" w:hAnsi="Times New Roman"/>
+        </w:rPr>
+        <w:t xml:space="preserve">的简单离子与</w:t>
+      </w:r>
+      <w:r>
+        <w:t xml:space="preserve"> W </w:t>
+      </w:r>
+      <w:r>
+        <w:rPr>
+          <w:rFonts w:hint="eastAsia" w:eastAsia="SimSun" w:ascii="Times New Roman" w:hAnsi="Times New Roman"/>
+        </w:rPr>
+        <w:t xml:space="preserve">的简单离子具有相同的电子层结构</w:t>
+      </w:r>
+    </w:p>
+    <w:p>
+      <w:pPr>
+        <w:pStyle w:val="Compact"/>
+        <w:numPr>
+          <w:ilvl w:val="0"/>
+          <w:numId w:val="1025"/>
+        </w:numPr>
+      </w:pPr>
+      <w:r>
+        <w:t xml:space="preserve">Z </w:t>
+      </w:r>
+      <w:r>
+        <w:rPr>
+          <w:rFonts w:hint="eastAsia" w:eastAsia="SimSun" w:ascii="Times New Roman" w:hAnsi="Times New Roman"/>
+        </w:rPr>
+        <w:t xml:space="preserve">的第一电离能在其同周期元素中最小</w:t>
+      </w:r>
+    </w:p>
+    <w:p>
+      <w:pPr>
+        <w:pStyle w:val="Compact"/>
+        <w:numPr>
+          <w:ilvl w:val="0"/>
+          <w:numId w:val="1025"/>
+        </w:numPr>
+      </w:pPr>
+      <w:r>
+        <w:t xml:space="preserve">W </w:t>
+      </w:r>
+      <w:r>
+        <w:rPr>
+          <w:rFonts w:hint="eastAsia" w:eastAsia="SimSun" w:ascii="Times New Roman" w:hAnsi="Times New Roman"/>
+        </w:rPr>
+        <w:t xml:space="preserve">的氧化物对应水化物为强酸</w:t>
+      </w:r>
+    </w:p>
+    <w:p>
+      <w:pPr>
+        <w:pStyle w:val="FirstParagraph"/>
+      </w:pPr>
+      <w:r>
+        <w:rPr>
+          <w:rFonts w:hint="eastAsia" w:eastAsia="SimSun" w:ascii="Times New Roman" w:hAnsi="Times New Roman"/>
+        </w:rPr>
+        <w:t xml:space="preserve">回答：(1)</w:t>
+      </w:r>
+      <w:r>
+        <w:t xml:space="preserve"> </w:t>
+      </w:r>
+      <w:r>
+        <w:rPr>
+          <w:rFonts w:hint="eastAsia" w:eastAsia="SimSun" w:ascii="Times New Roman" w:hAnsi="Times New Roman"/>
+        </w:rPr>
+        <w:t xml:space="preserve">写出</w:t>
+      </w:r>
+      <w:r>
+        <w:t xml:space="preserve"> X、Y、Z、W </w:t>
+      </w:r>
+      <w:r>
+        <w:rPr>
+          <w:rFonts w:hint="eastAsia" w:eastAsia="SimSun" w:ascii="Times New Roman" w:hAnsi="Times New Roman"/>
+        </w:rPr>
+        <w:t xml:space="preserve">的元素符号；(2)</w:t>
+      </w:r>
+      <w:r>
+        <w:t xml:space="preserve"> </w:t>
+      </w:r>
+      <w:r>
+        <w:rPr>
+          <w:rFonts w:hint="eastAsia" w:eastAsia="SimSun" w:ascii="Times New Roman" w:hAnsi="Times New Roman"/>
+        </w:rPr>
+        <w:t xml:space="preserve">比较</w:t>
+      </w:r>
+      <w:r>
+        <w:t xml:space="preserve"> X、Y、Z </w:t>
+      </w:r>
+      <w:r>
+        <w:rPr>
+          <w:rFonts w:hint="eastAsia" w:eastAsia="SimSun" w:ascii="Times New Roman" w:hAnsi="Times New Roman"/>
+        </w:rPr>
+        <w:t xml:space="preserve">的原子半径大小；(3)</w:t>
+      </w:r>
+      <w:r>
+        <w:t xml:space="preserve"> </w:t>
+      </w:r>
+      <w:r>
+        <w:rPr>
+          <w:rFonts w:hint="eastAsia" w:eastAsia="SimSun" w:ascii="Times New Roman" w:hAnsi="Times New Roman"/>
+        </w:rPr>
+        <w:t xml:space="preserve">比较</w:t>
+      </w:r>
+      <w:r>
+        <w:t xml:space="preserve"> Y </w:t>
+      </w:r>
+      <w:r>
+        <w:rPr>
+          <w:rFonts w:hint="eastAsia" w:eastAsia="SimSun" w:ascii="Times New Roman" w:hAnsi="Times New Roman"/>
+        </w:rPr>
+        <w:t xml:space="preserve">和</w:t>
+      </w:r>
+      <w:r>
+        <w:t xml:space="preserve"> W </w:t>
+      </w:r>
+      <w:r>
+        <w:rPr>
+          <w:rFonts w:hint="eastAsia" w:eastAsia="SimSun" w:ascii="Times New Roman" w:hAnsi="Times New Roman"/>
+        </w:rPr>
+        <w:t xml:space="preserve">的简单离子的半径大小；(4)</w:t>
+      </w:r>
+      <w:r>
+        <w:t xml:space="preserve"> </w:t>
+      </w:r>
+      <w:r>
+        <w:rPr>
+          <w:rFonts w:hint="eastAsia" w:eastAsia="SimSun" w:ascii="Times New Roman" w:hAnsi="Times New Roman"/>
+        </w:rPr>
+        <w:t xml:space="preserve">写出</w:t>
+      </w:r>
+      <w:r>
+        <w:t xml:space="preserve"> X </w:t>
+      </w:r>
+      <w:r>
+        <w:rPr>
+          <w:rFonts w:hint="eastAsia" w:eastAsia="SimSun" w:ascii="Times New Roman" w:hAnsi="Times New Roman"/>
+        </w:rPr>
+        <w:t xml:space="preserve">和</w:t>
+      </w:r>
+      <w:r>
+        <w:t xml:space="preserve"> Z </w:t>
+      </w:r>
+      <w:r>
+        <w:rPr>
+          <w:rFonts w:hint="eastAsia" w:eastAsia="SimSun" w:ascii="Times New Roman" w:hAnsi="Times New Roman"/>
+        </w:rPr>
+        <w:t xml:space="preserve">形成的化合物的化学式并判断键型。</w:t>
+      </w:r>
+    </w:p>
+    <w:p>
+      <w:pPr>
+        <w:pStyle w:val="Compact"/>
+        <w:numPr>
+          <w:ilvl w:val="0"/>
+          <w:numId w:val="1026"/>
+        </w:numPr>
+      </w:pPr>
+      <w:r>
+        <w:rPr>
+          <w:rFonts w:hint="eastAsia" w:eastAsia="SimSun" w:ascii="Times New Roman" w:hAnsi="Times New Roman"/>
+          <w:b/>
+          <w:bCs/>
+        </w:rPr>
+        <w:t xml:space="preserve">惰性电子对效应解释</w:t>
+      </w:r>
+      <w:r>
+        <w:rPr>
+          <w:rFonts w:hint="eastAsia" w:eastAsia="SimSun" w:ascii="Times New Roman" w:hAnsi="Times New Roman"/>
+        </w:rPr>
+        <w:t xml:space="preserve">（🏆）：已知</w:t>
+      </w:r>
+      <w:r>
+        <w:t xml:space="preserve"> Tl </w:t>
+      </w:r>
+      <w:r>
+        <w:rPr>
+          <w:rFonts w:hint="eastAsia" w:eastAsia="SimSun" w:ascii="Times New Roman" w:hAnsi="Times New Roman"/>
+        </w:rPr>
+        <w:t xml:space="preserve">在第六周期ⅢA</w:t>
+      </w:r>
+      <w:r>
+        <w:t xml:space="preserve"> </w:t>
+      </w:r>
+      <w:r>
+        <w:rPr>
+          <w:rFonts w:hint="eastAsia" w:eastAsia="SimSun" w:ascii="Times New Roman" w:hAnsi="Times New Roman"/>
+        </w:rPr>
+        <w:t xml:space="preserve">族，其常见氧化态为</w:t>
+      </w:r>
+      <w:r>
+        <w:t xml:space="preserve"> Tl(Ⅰ) </w:t>
+      </w:r>
+      <w:r>
+        <w:rPr>
+          <w:rFonts w:hint="eastAsia" w:eastAsia="SimSun" w:ascii="Times New Roman" w:hAnsi="Times New Roman"/>
+        </w:rPr>
+        <w:t xml:space="preserve">和</w:t>
+      </w:r>
+      <w:r>
+        <w:t xml:space="preserve"> </w:t>
+      </w:r>
+      <w:r>
+        <w:rPr>
+          <w:rFonts w:hint="eastAsia" w:eastAsia="SimSun" w:ascii="Times New Roman" w:hAnsi="Times New Roman"/>
+        </w:rPr>
+        <w:t xml:space="preserve">Tl(Ⅲ)，且</w:t>
+      </w:r>
+      <w:r>
+        <w:t xml:space="preserve"> Tl(Ⅰ) </w:t>
+      </w:r>
+      <w:r>
+        <w:rPr>
+          <w:rFonts w:hint="eastAsia" w:eastAsia="SimSun" w:ascii="Times New Roman" w:hAnsi="Times New Roman"/>
+        </w:rPr>
+        <w:t xml:space="preserve">比</w:t>
+      </w:r>
+      <w:r>
+        <w:t xml:space="preserve"> Tl(Ⅲ) </w:t>
+      </w:r>
+      <w:r>
+        <w:rPr>
+          <w:rFonts w:hint="eastAsia" w:eastAsia="SimSun" w:ascii="Times New Roman" w:hAnsi="Times New Roman"/>
+        </w:rPr>
+        <w:t xml:space="preserve">更稳定。请回答：</w:t>
+      </w:r>
+    </w:p>
+    <w:p>
+      <w:pPr>
+        <w:pStyle w:val="Compact"/>
+        <w:numPr>
+          <w:ilvl w:val="0"/>
+          <w:numId w:val="1027"/>
+        </w:numPr>
+      </w:pPr>
+      <w:r>
+        <w:rPr>
+          <w:rFonts w:hint="eastAsia" w:eastAsia="SimSun" w:ascii="Times New Roman" w:hAnsi="Times New Roman"/>
+        </w:rPr>
+        <w:t xml:space="preserve">这一现象叫什么？从电子结构角度解释原因。</w:t>
+      </w:r>
+    </w:p>
+    <w:p>
+      <w:pPr>
+        <w:pStyle w:val="Compact"/>
+        <w:numPr>
+          <w:ilvl w:val="0"/>
+          <w:numId w:val="1027"/>
+        </w:numPr>
+      </w:pPr>
+      <w:r>
+        <w:rPr>
+          <w:rFonts w:hint="eastAsia" w:eastAsia="SimSun" w:ascii="Times New Roman" w:hAnsi="Times New Roman"/>
+        </w:rPr>
+        <w:t xml:space="preserve">对比</w:t>
+      </w:r>
+      <w:r>
+        <w:t xml:space="preserve"> </w:t>
+      </w:r>
+      <w:r>
+        <w:rPr>
+          <w:rFonts w:hint="eastAsia" w:eastAsia="SimSun" w:ascii="Times New Roman" w:hAnsi="Times New Roman"/>
+        </w:rPr>
+        <w:t xml:space="preserve">Al（第三周期ⅢA</w:t>
+      </w:r>
+      <w:r>
+        <w:t xml:space="preserve"> </w:t>
+      </w:r>
+      <w:r>
+        <w:rPr>
+          <w:rFonts w:hint="eastAsia" w:eastAsia="SimSun" w:ascii="Times New Roman" w:hAnsi="Times New Roman"/>
+        </w:rPr>
+        <w:t xml:space="preserve">族）的常见氧化态，说明为什么同为ⅢA</w:t>
+      </w:r>
+      <w:r>
+        <w:t xml:space="preserve"> </w:t>
+      </w:r>
+      <w:r>
+        <w:rPr>
+          <w:rFonts w:hint="eastAsia" w:eastAsia="SimSun" w:ascii="Times New Roman" w:hAnsi="Times New Roman"/>
+        </w:rPr>
+        <w:t xml:space="preserve">族，趋势却不同。</w:t>
+      </w:r>
+    </w:p>
+    <w:p>
+      <w:pPr>
+        <w:pStyle w:val="Compact"/>
+        <w:numPr>
+          <w:ilvl w:val="0"/>
+          <w:numId w:val="1027"/>
+        </w:numPr>
+      </w:pPr>
+      <w:r>
+        <w:rPr>
+          <w:rFonts w:hint="eastAsia" w:eastAsia="SimSun" w:ascii="Times New Roman" w:hAnsi="Times New Roman"/>
+        </w:rPr>
+        <w:t xml:space="preserve">预测</w:t>
+      </w:r>
+      <w:r>
+        <w:t xml:space="preserve"> </w:t>
+      </w:r>
+      <w:r>
+        <w:rPr>
+          <w:rFonts w:hint="eastAsia" w:eastAsia="SimSun" w:ascii="Times New Roman" w:hAnsi="Times New Roman"/>
+        </w:rPr>
+        <w:t xml:space="preserve">In（第五周期ⅢA</w:t>
+      </w:r>
+      <w:r>
+        <w:t xml:space="preserve"> </w:t>
+      </w:r>
+      <w:r>
+        <w:rPr>
+          <w:rFonts w:hint="eastAsia" w:eastAsia="SimSun" w:ascii="Times New Roman" w:hAnsi="Times New Roman"/>
+        </w:rPr>
+        <w:t xml:space="preserve">族）的</w:t>
+      </w:r>
+      <w:r>
+        <w:t xml:space="preserve"> Tl(Ⅰ)/Tl(Ⅲ) </w:t>
+      </w:r>
+      <w:r>
+        <w:rPr>
+          <w:rFonts w:hint="eastAsia" w:eastAsia="SimSun" w:ascii="Times New Roman" w:hAnsi="Times New Roman"/>
+        </w:rPr>
+        <w:t xml:space="preserve">稳定性关系，说明理由。</w:t>
+      </w:r>
+    </w:p>
+    <w:p>
+      <w:pPr>
+        <w:spacing w:before="160" w:after="80"/>
+      </w:pPr>
+      <w:r>
+        <w:pict>
+          <v:rect style="width:0;height:1.5pt" o:hralign="center" o:hrstd="t" o:hr="t"/>
+        </w:pict>
+      </w:r>
+    </w:p>
+    <w:bookmarkEnd w:id="57"/>
+    <w:bookmarkEnd w:id="58"/>
+    <w:bookmarkStart w:id="59" w:name="八参考答案与提示"/>
+    <w:p>
+      <w:pPr>
+        <w:pStyle w:val="Heading2"/>
+        <w:spacing w:before="280" w:after="120"/>
+      </w:pPr>
+      <w:r>
+        <w:rPr>
+          <w:rFonts w:hint="eastAsia" w:eastAsia="SimHei" w:ascii="Times New Roman" w:hAnsi="Times New Roman"/>
+        </w:rPr>
+        <w:t xml:space="preserve">八、参考答案与提示</w:t>
+      </w:r>
+    </w:p>
+    <w:p>
+      <w:pPr>
+        <w:pStyle w:val="FirstParagraph"/>
+      </w:pPr>
+      <w:r>
+        <w:rPr>
+          <w:b/>
+          <w:bCs/>
+        </w:rPr>
+        <w:t xml:space="preserve">7.1 </w:t>
+      </w:r>
+      <w:r>
+        <w:rPr>
+          <w:rFonts w:hint="eastAsia" w:eastAsia="SimSun" w:ascii="Times New Roman" w:hAnsi="Times New Roman"/>
+          <w:b/>
+          <w:bCs/>
+        </w:rPr>
+        <w:t xml:space="preserve">基础巩固</w:t>
+      </w:r>
+    </w:p>
+    <w:p>
+      <w:pPr>
+        <w:pStyle w:val="Compact"/>
+        <w:numPr>
+          <w:ilvl w:val="0"/>
+          <w:numId w:val="1028"/>
+        </w:numPr>
+      </w:pPr>
     </w:p>
     <w:p>
       <w:pPr>
         <w:pStyle w:val="Compact"/>
         <w:numPr>
           <w:ilvl w:val="1"/>
-          <w:numId w:val="1023"/>
+          <w:numId w:val="1029"/>
         </w:numPr>
       </w:pPr>
       <w:r>
@@ -21859,7 +21807,7 @@
         <w:pStyle w:val="Compact"/>
         <w:numPr>
           <w:ilvl w:val="0"/>
-          <w:numId w:val="1022"/>
+          <w:numId w:val="1028"/>
         </w:numPr>
       </w:pPr>
     </w:p>
@@ -21868,7 +21816,7 @@
         <w:pStyle w:val="Compact"/>
         <w:numPr>
           <w:ilvl w:val="1"/>
-          <w:numId w:val="1024"/>
+          <w:numId w:val="1030"/>
         </w:numPr>
       </w:pPr>
       <w:r>
@@ -21907,7 +21855,7 @@
         <w:pStyle w:val="Compact"/>
         <w:numPr>
           <w:ilvl w:val="0"/>
-          <w:numId w:val="1022"/>
+          <w:numId w:val="1028"/>
         </w:numPr>
       </w:pPr>
       <w:r>
@@ -21974,7 +21922,7 @@
       <w:pPr>
         <w:numPr>
           <w:ilvl w:val="0"/>
-          <w:numId w:val="1025"/>
+          <w:numId w:val="1031"/>
         </w:numPr>
       </w:pPr>
       <w:r>
@@ -22105,7 +22053,7 @@
       <w:pPr>
         <w:numPr>
           <w:ilvl w:val="0"/>
-          <w:numId w:val="1025"/>
+          <w:numId w:val="1031"/>
         </w:numPr>
       </w:pPr>
       <w:r>
@@ -22301,7 +22249,7 @@
       <w:pPr>
         <w:numPr>
           <w:ilvl w:val="0"/>
-          <w:numId w:val="1025"/>
+          <w:numId w:val="1031"/>
         </w:numPr>
       </w:pPr>
       <w:r>
@@ -22361,7 +22309,7 @@
       <w:pPr>
         <w:numPr>
           <w:ilvl w:val="0"/>
-          <w:numId w:val="1026"/>
+          <w:numId w:val="1032"/>
         </w:numPr>
       </w:pPr>
       <w:r>
@@ -22518,7 +22466,7 @@
       <w:pPr>
         <w:numPr>
           <w:ilvl w:val="0"/>
-          <w:numId w:val="1026"/>
+          <w:numId w:val="1032"/>
         </w:numPr>
       </w:pPr>
       <w:r>
@@ -22685,7 +22633,7 @@
       <w:pPr>
         <w:numPr>
           <w:ilvl w:val="0"/>
-          <w:numId w:val="1026"/>
+          <w:numId w:val="1032"/>
         </w:numPr>
       </w:pPr>
       <w:r>
@@ -22707,8 +22655,8 @@
       <w:pPr>
         <w:pStyle w:val="Compact"/>
         <w:numPr>
-          <w:ilvl w:val="1"/>
-          <w:numId w:val="1027"/>
+          <w:ilvl w:val="0"/>
+          <w:numId w:val="1033"/>
         </w:numPr>
       </w:pPr>
       <w:r>
@@ -22833,8 +22781,8 @@
       <w:pPr>
         <w:pStyle w:val="Compact"/>
         <w:numPr>
-          <w:ilvl w:val="1"/>
-          <w:numId w:val="1027"/>
+          <w:ilvl w:val="0"/>
+          <w:numId w:val="1033"/>
         </w:numPr>
       </w:pPr>
       <w:r>
@@ -22945,8 +22893,8 @@
       <w:pPr>
         <w:pStyle w:val="Compact"/>
         <w:numPr>
-          <w:ilvl w:val="1"/>
-          <w:numId w:val="1027"/>
+          <w:ilvl w:val="0"/>
+          <w:numId w:val="1033"/>
         </w:numPr>
       </w:pPr>
       <w:r>
@@ -23106,7 +23054,7 @@
         <w:pStyle w:val="Compact"/>
         <w:numPr>
           <w:ilvl w:val="0"/>
-          <w:numId w:val="1028"/>
+          <w:numId w:val="1034"/>
         </w:numPr>
       </w:pPr>
       <w:r>
@@ -23130,7 +23078,7 @@
         <w:pStyle w:val="Compact"/>
         <w:numPr>
           <w:ilvl w:val="0"/>
-          <w:numId w:val="1028"/>
+          <w:numId w:val="1034"/>
         </w:numPr>
       </w:pPr>
       <w:r>
@@ -23154,7 +23102,7 @@
         <w:pStyle w:val="Compact"/>
         <w:numPr>
           <w:ilvl w:val="0"/>
-          <w:numId w:val="1028"/>
+          <w:numId w:val="1034"/>
         </w:numPr>
       </w:pPr>
       <w:r>
@@ -23178,7 +23126,7 @@
         <w:pStyle w:val="Compact"/>
         <w:numPr>
           <w:ilvl w:val="0"/>
-          <w:numId w:val="1028"/>
+          <w:numId w:val="1034"/>
         </w:numPr>
       </w:pPr>
       <w:r>
@@ -23207,7 +23155,7 @@
         <w:pStyle w:val="Compact"/>
         <w:numPr>
           <w:ilvl w:val="0"/>
-          <w:numId w:val="1028"/>
+          <w:numId w:val="1034"/>
         </w:numPr>
       </w:pPr>
       <w:r>
@@ -23231,7 +23179,7 @@
         <w:pStyle w:val="Compact"/>
         <w:numPr>
           <w:ilvl w:val="0"/>
-          <w:numId w:val="1028"/>
+          <w:numId w:val="1034"/>
         </w:numPr>
       </w:pPr>
       <w:r>
@@ -23255,7 +23203,7 @@
         <w:pStyle w:val="Compact"/>
         <w:numPr>
           <w:ilvl w:val="0"/>
-          <w:numId w:val="1028"/>
+          <w:numId w:val="1034"/>
         </w:numPr>
       </w:pPr>
       <w:r>
@@ -23279,7 +23227,7 @@
         <w:pStyle w:val="Compact"/>
         <w:numPr>
           <w:ilvl w:val="0"/>
-          <w:numId w:val="1028"/>
+          <w:numId w:val="1034"/>
         </w:numPr>
       </w:pPr>
       <w:r>
@@ -23325,12 +23273,27 @@
       <w:jc w:val="center"/>
     </w:pPr>
     <w:r>
+      <w:rPr>
+        <w:rFonts w:ascii="Times New Roman" w:hAnsi="Times New Roman" w:eastAsia="Times New Roman"/>
+        <w:b w:val="0"/>
+        <w:sz w:val="20"/>
+      </w:rPr>
       <w:fldChar w:fldCharType="begin"/>
     </w:r>
     <w:r>
+      <w:rPr>
+        <w:rFonts w:ascii="Times New Roman" w:hAnsi="Times New Roman" w:eastAsia="Times New Roman"/>
+        <w:b w:val="0"/>
+        <w:sz w:val="20"/>
+      </w:rPr>
       <w:instrText xml:space="preserve"> PAGE </w:instrText>
     </w:r>
     <w:r>
+      <w:rPr>
+        <w:rFonts w:ascii="Times New Roman" w:hAnsi="Times New Roman" w:eastAsia="Times New Roman"/>
+        <w:b w:val="0"/>
+        <w:sz w:val="20"/>
+      </w:rPr>
       <w:fldChar w:fldCharType="end"/>
     </w:r>
   </w:p>
@@ -23792,6 +23755,176 @@
       </w:pPr>
     </w:lvl>
   </w:abstractNum>
+  <w:abstractNum w:abstractNumId="99412">
+    <w:nsid w:val="00A99412"/>
+    <w:multiLevelType w:val="multilevel"/>
+    <w:lvl w:ilvl="0">
+      <w:start w:val="2"/>
+      <w:numFmt w:val="decimal"/>
+      <w:lvlText w:val="%1."/>
+      <w:lvlJc w:val="left"/>
+      <w:pPr>
+        <w:ind w:left="720" w:hanging="360"/>
+      </w:pPr>
+    </w:lvl>
+    <w:lvl w:ilvl="1">
+      <w:start w:val="2"/>
+      <w:numFmt w:val="decimal"/>
+      <w:lvlText w:val="%2."/>
+      <w:lvlJc w:val="left"/>
+      <w:pPr>
+        <w:ind w:left="1440" w:hanging="360"/>
+      </w:pPr>
+    </w:lvl>
+    <w:lvl w:ilvl="2">
+      <w:start w:val="2"/>
+      <w:numFmt w:val="decimal"/>
+      <w:lvlText w:val="%3."/>
+      <w:lvlJc w:val="left"/>
+      <w:pPr>
+        <w:ind w:left="2160" w:hanging="360"/>
+      </w:pPr>
+    </w:lvl>
+    <w:lvl w:ilvl="3">
+      <w:start w:val="2"/>
+      <w:numFmt w:val="decimal"/>
+      <w:lvlText w:val="%4."/>
+      <w:lvlJc w:val="left"/>
+      <w:pPr>
+        <w:ind w:left="2880" w:hanging="360"/>
+      </w:pPr>
+    </w:lvl>
+    <w:lvl w:ilvl="4">
+      <w:start w:val="2"/>
+      <w:numFmt w:val="decimal"/>
+      <w:lvlText w:val="%5."/>
+      <w:lvlJc w:val="left"/>
+      <w:pPr>
+        <w:ind w:left="3600" w:hanging="360"/>
+      </w:pPr>
+    </w:lvl>
+    <w:lvl w:ilvl="5">
+      <w:start w:val="2"/>
+      <w:numFmt w:val="decimal"/>
+      <w:lvlText w:val="%6."/>
+      <w:lvlJc w:val="left"/>
+      <w:pPr>
+        <w:ind w:left="4320" w:hanging="360"/>
+      </w:pPr>
+    </w:lvl>
+    <w:lvl w:ilvl="6">
+      <w:start w:val="2"/>
+      <w:numFmt w:val="decimal"/>
+      <w:lvlText w:val="%7."/>
+      <w:lvlJc w:val="left"/>
+      <w:pPr>
+        <w:ind w:left="5040" w:hanging="360"/>
+      </w:pPr>
+    </w:lvl>
+    <w:lvl w:ilvl="7">
+      <w:start w:val="2"/>
+      <w:numFmt w:val="decimal"/>
+      <w:lvlText w:val="%8."/>
+      <w:lvlJc w:val="left"/>
+      <w:pPr>
+        <w:ind w:left="5760" w:hanging="360"/>
+      </w:pPr>
+    </w:lvl>
+    <w:lvl w:ilvl="8">
+      <w:start w:val="2"/>
+      <w:numFmt w:val="decimal"/>
+      <w:lvlText w:val="%9."/>
+      <w:lvlJc w:val="left"/>
+      <w:pPr>
+        <w:ind w:left="6480" w:hanging="360"/>
+      </w:pPr>
+    </w:lvl>
+  </w:abstractNum>
+  <w:abstractNum w:abstractNumId="99413">
+    <w:nsid w:val="00A99413"/>
+    <w:multiLevelType w:val="multilevel"/>
+    <w:lvl w:ilvl="0">
+      <w:start w:val="3"/>
+      <w:numFmt w:val="decimal"/>
+      <w:lvlText w:val="%1."/>
+      <w:lvlJc w:val="left"/>
+      <w:pPr>
+        <w:ind w:left="720" w:hanging="360"/>
+      </w:pPr>
+    </w:lvl>
+    <w:lvl w:ilvl="1">
+      <w:start w:val="3"/>
+      <w:numFmt w:val="decimal"/>
+      <w:lvlText w:val="%2."/>
+      <w:lvlJc w:val="left"/>
+      <w:pPr>
+        <w:ind w:left="1440" w:hanging="360"/>
+      </w:pPr>
+    </w:lvl>
+    <w:lvl w:ilvl="2">
+      <w:start w:val="3"/>
+      <w:numFmt w:val="decimal"/>
+      <w:lvlText w:val="%3."/>
+      <w:lvlJc w:val="left"/>
+      <w:pPr>
+        <w:ind w:left="2160" w:hanging="360"/>
+      </w:pPr>
+    </w:lvl>
+    <w:lvl w:ilvl="3">
+      <w:start w:val="3"/>
+      <w:numFmt w:val="decimal"/>
+      <w:lvlText w:val="%4."/>
+      <w:lvlJc w:val="left"/>
+      <w:pPr>
+        <w:ind w:left="2880" w:hanging="360"/>
+      </w:pPr>
+    </w:lvl>
+    <w:lvl w:ilvl="4">
+      <w:start w:val="3"/>
+      <w:numFmt w:val="decimal"/>
+      <w:lvlText w:val="%5."/>
+      <w:lvlJc w:val="left"/>
+      <w:pPr>
+        <w:ind w:left="3600" w:hanging="360"/>
+      </w:pPr>
+    </w:lvl>
+    <w:lvl w:ilvl="5">
+      <w:start w:val="3"/>
+      <w:numFmt w:val="decimal"/>
+      <w:lvlText w:val="%6."/>
+      <w:lvlJc w:val="left"/>
+      <w:pPr>
+        <w:ind w:left="4320" w:hanging="360"/>
+      </w:pPr>
+    </w:lvl>
+    <w:lvl w:ilvl="6">
+      <w:start w:val="3"/>
+      <w:numFmt w:val="decimal"/>
+      <w:lvlText w:val="%7."/>
+      <w:lvlJc w:val="left"/>
+      <w:pPr>
+        <w:ind w:left="5040" w:hanging="360"/>
+      </w:pPr>
+    </w:lvl>
+    <w:lvl w:ilvl="7">
+      <w:start w:val="3"/>
+      <w:numFmt w:val="decimal"/>
+      <w:lvlText w:val="%8."/>
+      <w:lvlJc w:val="left"/>
+      <w:pPr>
+        <w:ind w:left="5760" w:hanging="360"/>
+      </w:pPr>
+    </w:lvl>
+    <w:lvl w:ilvl="8">
+      <w:start w:val="3"/>
+      <w:numFmt w:val="decimal"/>
+      <w:lvlText w:val="%9."/>
+      <w:lvlJc w:val="left"/>
+      <w:pPr>
+        <w:ind w:left="6480" w:hanging="360"/>
+      </w:pPr>
+    </w:lvl>
+  </w:abstractNum>
   <w:abstractNum w:abstractNumId="99414">
     <w:nsid w:val="00A99414"/>
     <w:multiLevelType w:val="multilevel"/>
@@ -23869,6 +24002,176 @@
     </w:lvl>
     <w:lvl w:ilvl="8">
       <w:start w:val="4"/>
+      <w:numFmt w:val="decimal"/>
+      <w:lvlText w:val="%9."/>
+      <w:lvlJc w:val="left"/>
+      <w:pPr>
+        <w:ind w:left="6480" w:hanging="360"/>
+      </w:pPr>
+    </w:lvl>
+  </w:abstractNum>
+  <w:abstractNum w:abstractNumId="99415">
+    <w:nsid w:val="00A99415"/>
+    <w:multiLevelType w:val="multilevel"/>
+    <w:lvl w:ilvl="0">
+      <w:start w:val="5"/>
+      <w:numFmt w:val="decimal"/>
+      <w:lvlText w:val="%1."/>
+      <w:lvlJc w:val="left"/>
+      <w:pPr>
+        <w:ind w:left="720" w:hanging="360"/>
+      </w:pPr>
+    </w:lvl>
+    <w:lvl w:ilvl="1">
+      <w:start w:val="5"/>
+      <w:numFmt w:val="decimal"/>
+      <w:lvlText w:val="%2."/>
+      <w:lvlJc w:val="left"/>
+      <w:pPr>
+        <w:ind w:left="1440" w:hanging="360"/>
+      </w:pPr>
+    </w:lvl>
+    <w:lvl w:ilvl="2">
+      <w:start w:val="5"/>
+      <w:numFmt w:val="decimal"/>
+      <w:lvlText w:val="%3."/>
+      <w:lvlJc w:val="left"/>
+      <w:pPr>
+        <w:ind w:left="2160" w:hanging="360"/>
+      </w:pPr>
+    </w:lvl>
+    <w:lvl w:ilvl="3">
+      <w:start w:val="5"/>
+      <w:numFmt w:val="decimal"/>
+      <w:lvlText w:val="%4."/>
+      <w:lvlJc w:val="left"/>
+      <w:pPr>
+        <w:ind w:left="2880" w:hanging="360"/>
+      </w:pPr>
+    </w:lvl>
+    <w:lvl w:ilvl="4">
+      <w:start w:val="5"/>
+      <w:numFmt w:val="decimal"/>
+      <w:lvlText w:val="%5."/>
+      <w:lvlJc w:val="left"/>
+      <w:pPr>
+        <w:ind w:left="3600" w:hanging="360"/>
+      </w:pPr>
+    </w:lvl>
+    <w:lvl w:ilvl="5">
+      <w:start w:val="5"/>
+      <w:numFmt w:val="decimal"/>
+      <w:lvlText w:val="%6."/>
+      <w:lvlJc w:val="left"/>
+      <w:pPr>
+        <w:ind w:left="4320" w:hanging="360"/>
+      </w:pPr>
+    </w:lvl>
+    <w:lvl w:ilvl="6">
+      <w:start w:val="5"/>
+      <w:numFmt w:val="decimal"/>
+      <w:lvlText w:val="%7."/>
+      <w:lvlJc w:val="left"/>
+      <w:pPr>
+        <w:ind w:left="5040" w:hanging="360"/>
+      </w:pPr>
+    </w:lvl>
+    <w:lvl w:ilvl="7">
+      <w:start w:val="5"/>
+      <w:numFmt w:val="decimal"/>
+      <w:lvlText w:val="%8."/>
+      <w:lvlJc w:val="left"/>
+      <w:pPr>
+        <w:ind w:left="5760" w:hanging="360"/>
+      </w:pPr>
+    </w:lvl>
+    <w:lvl w:ilvl="8">
+      <w:start w:val="5"/>
+      <w:numFmt w:val="decimal"/>
+      <w:lvlText w:val="%9."/>
+      <w:lvlJc w:val="left"/>
+      <w:pPr>
+        <w:ind w:left="6480" w:hanging="360"/>
+      </w:pPr>
+    </w:lvl>
+  </w:abstractNum>
+  <w:abstractNum w:abstractNumId="99416">
+    <w:nsid w:val="00A99416"/>
+    <w:multiLevelType w:val="multilevel"/>
+    <w:lvl w:ilvl="0">
+      <w:start w:val="6"/>
+      <w:numFmt w:val="decimal"/>
+      <w:lvlText w:val="%1."/>
+      <w:lvlJc w:val="left"/>
+      <w:pPr>
+        <w:ind w:left="720" w:hanging="360"/>
+      </w:pPr>
+    </w:lvl>
+    <w:lvl w:ilvl="1">
+      <w:start w:val="6"/>
+      <w:numFmt w:val="decimal"/>
+      <w:lvlText w:val="%2."/>
+      <w:lvlJc w:val="left"/>
+      <w:pPr>
+        <w:ind w:left="1440" w:hanging="360"/>
+      </w:pPr>
+    </w:lvl>
+    <w:lvl w:ilvl="2">
+      <w:start w:val="6"/>
+      <w:numFmt w:val="decimal"/>
+      <w:lvlText w:val="%3."/>
+      <w:lvlJc w:val="left"/>
+      <w:pPr>
+        <w:ind w:left="2160" w:hanging="360"/>
+      </w:pPr>
+    </w:lvl>
+    <w:lvl w:ilvl="3">
+      <w:start w:val="6"/>
+      <w:numFmt w:val="decimal"/>
+      <w:lvlText w:val="%4."/>
+      <w:lvlJc w:val="left"/>
+      <w:pPr>
+        <w:ind w:left="2880" w:hanging="360"/>
+      </w:pPr>
+    </w:lvl>
+    <w:lvl w:ilvl="4">
+      <w:start w:val="6"/>
+      <w:numFmt w:val="decimal"/>
+      <w:lvlText w:val="%5."/>
+      <w:lvlJc w:val="left"/>
+      <w:pPr>
+        <w:ind w:left="3600" w:hanging="360"/>
+      </w:pPr>
+    </w:lvl>
+    <w:lvl w:ilvl="5">
+      <w:start w:val="6"/>
+      <w:numFmt w:val="decimal"/>
+      <w:lvlText w:val="%6."/>
+      <w:lvlJc w:val="left"/>
+      <w:pPr>
+        <w:ind w:left="4320" w:hanging="360"/>
+      </w:pPr>
+    </w:lvl>
+    <w:lvl w:ilvl="6">
+      <w:start w:val="6"/>
+      <w:numFmt w:val="decimal"/>
+      <w:lvlText w:val="%7."/>
+      <w:lvlJc w:val="left"/>
+      <w:pPr>
+        <w:ind w:left="5040" w:hanging="360"/>
+      </w:pPr>
+    </w:lvl>
+    <w:lvl w:ilvl="7">
+      <w:start w:val="6"/>
+      <w:numFmt w:val="decimal"/>
+      <w:lvlText w:val="%8."/>
+      <w:lvlJc w:val="left"/>
+      <w:pPr>
+        <w:ind w:left="5760" w:hanging="360"/>
+      </w:pPr>
+    </w:lvl>
+    <w:lvl w:ilvl="8">
+      <w:start w:val="6"/>
       <w:numFmt w:val="decimal"/>
       <w:lvlText w:val="%9."/>
       <w:lvlJc w:val="left"/>
@@ -23954,6 +24257,176 @@
     </w:lvl>
     <w:lvl w:ilvl="8">
       <w:start w:val="7"/>
+      <w:numFmt w:val="decimal"/>
+      <w:lvlText w:val="%9."/>
+      <w:lvlJc w:val="left"/>
+      <w:pPr>
+        <w:ind w:left="6480" w:hanging="360"/>
+      </w:pPr>
+    </w:lvl>
+  </w:abstractNum>
+  <w:abstractNum w:abstractNumId="99418">
+    <w:nsid w:val="00A99418"/>
+    <w:multiLevelType w:val="multilevel"/>
+    <w:lvl w:ilvl="0">
+      <w:start w:val="8"/>
+      <w:numFmt w:val="decimal"/>
+      <w:lvlText w:val="%1."/>
+      <w:lvlJc w:val="left"/>
+      <w:pPr>
+        <w:ind w:left="720" w:hanging="360"/>
+      </w:pPr>
+    </w:lvl>
+    <w:lvl w:ilvl="1">
+      <w:start w:val="8"/>
+      <w:numFmt w:val="decimal"/>
+      <w:lvlText w:val="%2."/>
+      <w:lvlJc w:val="left"/>
+      <w:pPr>
+        <w:ind w:left="1440" w:hanging="360"/>
+      </w:pPr>
+    </w:lvl>
+    <w:lvl w:ilvl="2">
+      <w:start w:val="8"/>
+      <w:numFmt w:val="decimal"/>
+      <w:lvlText w:val="%3."/>
+      <w:lvlJc w:val="left"/>
+      <w:pPr>
+        <w:ind w:left="2160" w:hanging="360"/>
+      </w:pPr>
+    </w:lvl>
+    <w:lvl w:ilvl="3">
+      <w:start w:val="8"/>
+      <w:numFmt w:val="decimal"/>
+      <w:lvlText w:val="%4."/>
+      <w:lvlJc w:val="left"/>
+      <w:pPr>
+        <w:ind w:left="2880" w:hanging="360"/>
+      </w:pPr>
+    </w:lvl>
+    <w:lvl w:ilvl="4">
+      <w:start w:val="8"/>
+      <w:numFmt w:val="decimal"/>
+      <w:lvlText w:val="%5."/>
+      <w:lvlJc w:val="left"/>
+      <w:pPr>
+        <w:ind w:left="3600" w:hanging="360"/>
+      </w:pPr>
+    </w:lvl>
+    <w:lvl w:ilvl="5">
+      <w:start w:val="8"/>
+      <w:numFmt w:val="decimal"/>
+      <w:lvlText w:val="%6."/>
+      <w:lvlJc w:val="left"/>
+      <w:pPr>
+        <w:ind w:left="4320" w:hanging="360"/>
+      </w:pPr>
+    </w:lvl>
+    <w:lvl w:ilvl="6">
+      <w:start w:val="8"/>
+      <w:numFmt w:val="decimal"/>
+      <w:lvlText w:val="%7."/>
+      <w:lvlJc w:val="left"/>
+      <w:pPr>
+        <w:ind w:left="5040" w:hanging="360"/>
+      </w:pPr>
+    </w:lvl>
+    <w:lvl w:ilvl="7">
+      <w:start w:val="8"/>
+      <w:numFmt w:val="decimal"/>
+      <w:lvlText w:val="%8."/>
+      <w:lvlJc w:val="left"/>
+      <w:pPr>
+        <w:ind w:left="5760" w:hanging="360"/>
+      </w:pPr>
+    </w:lvl>
+    <w:lvl w:ilvl="8">
+      <w:start w:val="8"/>
+      <w:numFmt w:val="decimal"/>
+      <w:lvlText w:val="%9."/>
+      <w:lvlJc w:val="left"/>
+      <w:pPr>
+        <w:ind w:left="6480" w:hanging="360"/>
+      </w:pPr>
+    </w:lvl>
+  </w:abstractNum>
+  <w:abstractNum w:abstractNumId="99419">
+    <w:nsid w:val="00A99419"/>
+    <w:multiLevelType w:val="multilevel"/>
+    <w:lvl w:ilvl="0">
+      <w:start w:val="9"/>
+      <w:numFmt w:val="decimal"/>
+      <w:lvlText w:val="%1."/>
+      <w:lvlJc w:val="left"/>
+      <w:pPr>
+        <w:ind w:left="720" w:hanging="360"/>
+      </w:pPr>
+    </w:lvl>
+    <w:lvl w:ilvl="1">
+      <w:start w:val="9"/>
+      <w:numFmt w:val="decimal"/>
+      <w:lvlText w:val="%2."/>
+      <w:lvlJc w:val="left"/>
+      <w:pPr>
+        <w:ind w:left="1440" w:hanging="360"/>
+      </w:pPr>
+    </w:lvl>
+    <w:lvl w:ilvl="2">
+      <w:start w:val="9"/>
+      <w:numFmt w:val="decimal"/>
+      <w:lvlText w:val="%3."/>
+      <w:lvlJc w:val="left"/>
+      <w:pPr>
+        <w:ind w:left="2160" w:hanging="360"/>
+      </w:pPr>
+    </w:lvl>
+    <w:lvl w:ilvl="3">
+      <w:start w:val="9"/>
+      <w:numFmt w:val="decimal"/>
+      <w:lvlText w:val="%4."/>
+      <w:lvlJc w:val="left"/>
+      <w:pPr>
+        <w:ind w:left="2880" w:hanging="360"/>
+      </w:pPr>
+    </w:lvl>
+    <w:lvl w:ilvl="4">
+      <w:start w:val="9"/>
+      <w:numFmt w:val="decimal"/>
+      <w:lvlText w:val="%5."/>
+      <w:lvlJc w:val="left"/>
+      <w:pPr>
+        <w:ind w:left="3600" w:hanging="360"/>
+      </w:pPr>
+    </w:lvl>
+    <w:lvl w:ilvl="5">
+      <w:start w:val="9"/>
+      <w:numFmt w:val="decimal"/>
+      <w:lvlText w:val="%6."/>
+      <w:lvlJc w:val="left"/>
+      <w:pPr>
+        <w:ind w:left="4320" w:hanging="360"/>
+      </w:pPr>
+    </w:lvl>
+    <w:lvl w:ilvl="6">
+      <w:start w:val="9"/>
+      <w:numFmt w:val="decimal"/>
+      <w:lvlText w:val="%7."/>
+      <w:lvlJc w:val="left"/>
+      <w:pPr>
+        <w:ind w:left="5040" w:hanging="360"/>
+      </w:pPr>
+    </w:lvl>
+    <w:lvl w:ilvl="7">
+      <w:start w:val="9"/>
+      <w:numFmt w:val="decimal"/>
+      <w:lvlText w:val="%8."/>
+      <w:lvlJc w:val="left"/>
+      <w:pPr>
+        <w:ind w:left="5760" w:hanging="360"/>
+      </w:pPr>
+    </w:lvl>
+    <w:lvl w:ilvl="8">
+      <w:start w:val="9"/>
       <w:numFmt w:val="decimal"/>
       <w:lvlText w:val="%9."/>
       <w:lvlJc w:val="left"/>
@@ -24248,6 +24721,36 @@
     </w:lvlOverride>
   </w:num>
   <w:num w:numId="1014">
+    <w:abstractNumId w:val="99412"/>
+    <w:lvlOverride w:ilvl="0">
+      <w:startOverride w:val="2"/>
+    </w:lvlOverride>
+    <w:lvlOverride w:ilvl="1">
+      <w:startOverride w:val="2"/>
+    </w:lvlOverride>
+    <w:lvlOverride w:ilvl="2">
+      <w:startOverride w:val="2"/>
+    </w:lvlOverride>
+    <w:lvlOverride w:ilvl="3">
+      <w:startOverride w:val="2"/>
+    </w:lvlOverride>
+    <w:lvlOverride w:ilvl="4">
+      <w:startOverride w:val="2"/>
+    </w:lvlOverride>
+    <w:lvlOverride w:ilvl="5">
+      <w:startOverride w:val="2"/>
+    </w:lvlOverride>
+    <w:lvlOverride w:ilvl="6">
+      <w:startOverride w:val="2"/>
+    </w:lvlOverride>
+    <w:lvlOverride w:ilvl="7">
+      <w:startOverride w:val="2"/>
+    </w:lvlOverride>
+    <w:lvlOverride w:ilvl="8">
+      <w:startOverride w:val="2"/>
+    </w:lvlOverride>
+  </w:num>
+  <w:num w:numId="1015">
     <w:abstractNumId w:val="99431"/>
     <w:lvlOverride w:ilvl="0">
       <w:startOverride w:val="1"/>
@@ -24277,7 +24780,37 @@
       <w:startOverride w:val="1"/>
     </w:lvlOverride>
   </w:num>
-  <w:num w:numId="1015">
+  <w:num w:numId="1016">
+    <w:abstractNumId w:val="99413"/>
+    <w:lvlOverride w:ilvl="0">
+      <w:startOverride w:val="3"/>
+    </w:lvlOverride>
+    <w:lvlOverride w:ilvl="1">
+      <w:startOverride w:val="3"/>
+    </w:lvlOverride>
+    <w:lvlOverride w:ilvl="2">
+      <w:startOverride w:val="3"/>
+    </w:lvlOverride>
+    <w:lvlOverride w:ilvl="3">
+      <w:startOverride w:val="3"/>
+    </w:lvlOverride>
+    <w:lvlOverride w:ilvl="4">
+      <w:startOverride w:val="3"/>
+    </w:lvlOverride>
+    <w:lvlOverride w:ilvl="5">
+      <w:startOverride w:val="3"/>
+    </w:lvlOverride>
+    <w:lvlOverride w:ilvl="6">
+      <w:startOverride w:val="3"/>
+    </w:lvlOverride>
+    <w:lvlOverride w:ilvl="7">
+      <w:startOverride w:val="3"/>
+    </w:lvlOverride>
+    <w:lvlOverride w:ilvl="8">
+      <w:startOverride w:val="3"/>
+    </w:lvlOverride>
+  </w:num>
+  <w:num w:numId="1017">
     <w:abstractNumId w:val="99414"/>
     <w:lvlOverride w:ilvl="0">
       <w:startOverride w:val="4"/>
@@ -24307,7 +24840,7 @@
       <w:startOverride w:val="4"/>
     </w:lvlOverride>
   </w:num>
-  <w:num w:numId="1016">
+  <w:num w:numId="1018">
     <w:abstractNumId w:val="99431"/>
     <w:lvlOverride w:ilvl="0">
       <w:startOverride w:val="1"/>
@@ -24337,7 +24870,37 @@
       <w:startOverride w:val="1"/>
     </w:lvlOverride>
   </w:num>
-  <w:num w:numId="1017">
+  <w:num w:numId="1019">
+    <w:abstractNumId w:val="99415"/>
+    <w:lvlOverride w:ilvl="0">
+      <w:startOverride w:val="5"/>
+    </w:lvlOverride>
+    <w:lvlOverride w:ilvl="1">
+      <w:startOverride w:val="5"/>
+    </w:lvlOverride>
+    <w:lvlOverride w:ilvl="2">
+      <w:startOverride w:val="5"/>
+    </w:lvlOverride>
+    <w:lvlOverride w:ilvl="3">
+      <w:startOverride w:val="5"/>
+    </w:lvlOverride>
+    <w:lvlOverride w:ilvl="4">
+      <w:startOverride w:val="5"/>
+    </w:lvlOverride>
+    <w:lvlOverride w:ilvl="5">
+      <w:startOverride w:val="5"/>
+    </w:lvlOverride>
+    <w:lvlOverride w:ilvl="6">
+      <w:startOverride w:val="5"/>
+    </w:lvlOverride>
+    <w:lvlOverride w:ilvl="7">
+      <w:startOverride w:val="5"/>
+    </w:lvlOverride>
+    <w:lvlOverride w:ilvl="8">
+      <w:startOverride w:val="5"/>
+    </w:lvlOverride>
+  </w:num>
+  <w:num w:numId="1020">
     <w:abstractNumId w:val="99431"/>
     <w:lvlOverride w:ilvl="0">
       <w:startOverride w:val="1"/>
@@ -24367,7 +24930,37 @@
       <w:startOverride w:val="1"/>
     </w:lvlOverride>
   </w:num>
-  <w:num w:numId="1018">
+  <w:num w:numId="1021">
+    <w:abstractNumId w:val="99416"/>
+    <w:lvlOverride w:ilvl="0">
+      <w:startOverride w:val="6"/>
+    </w:lvlOverride>
+    <w:lvlOverride w:ilvl="1">
+      <w:startOverride w:val="6"/>
+    </w:lvlOverride>
+    <w:lvlOverride w:ilvl="2">
+      <w:startOverride w:val="6"/>
+    </w:lvlOverride>
+    <w:lvlOverride w:ilvl="3">
+      <w:startOverride w:val="6"/>
+    </w:lvlOverride>
+    <w:lvlOverride w:ilvl="4">
+      <w:startOverride w:val="6"/>
+    </w:lvlOverride>
+    <w:lvlOverride w:ilvl="5">
+      <w:startOverride w:val="6"/>
+    </w:lvlOverride>
+    <w:lvlOverride w:ilvl="6">
+      <w:startOverride w:val="6"/>
+    </w:lvlOverride>
+    <w:lvlOverride w:ilvl="7">
+      <w:startOverride w:val="6"/>
+    </w:lvlOverride>
+    <w:lvlOverride w:ilvl="8">
+      <w:startOverride w:val="6"/>
+    </w:lvlOverride>
+  </w:num>
+  <w:num w:numId="1022">
     <w:abstractNumId w:val="99417"/>
     <w:lvlOverride w:ilvl="0">
       <w:startOverride w:val="7"/>
@@ -24397,190 +24990,70 @@
       <w:startOverride w:val="7"/>
     </w:lvlOverride>
   </w:num>
-  <w:num w:numId="1019">
+  <w:num w:numId="1023">
     <w:abstractNumId w:val="991"/>
   </w:num>
-  <w:num w:numId="1020">
-    <w:abstractNumId w:val="991"/>
-  </w:num>
-  <w:num w:numId="1021">
-    <w:abstractNumId w:val="99431"/>
+  <w:num w:numId="1024">
+    <w:abstractNumId w:val="99418"/>
     <w:lvlOverride w:ilvl="0">
-      <w:startOverride w:val="1"/>
+      <w:startOverride w:val="8"/>
     </w:lvlOverride>
     <w:lvlOverride w:ilvl="1">
-      <w:startOverride w:val="1"/>
+      <w:startOverride w:val="8"/>
     </w:lvlOverride>
     <w:lvlOverride w:ilvl="2">
-      <w:startOverride w:val="1"/>
+      <w:startOverride w:val="8"/>
     </w:lvlOverride>
     <w:lvlOverride w:ilvl="3">
-      <w:startOverride w:val="1"/>
+      <w:startOverride w:val="8"/>
     </w:lvlOverride>
     <w:lvlOverride w:ilvl="4">
-      <w:startOverride w:val="1"/>
+      <w:startOverride w:val="8"/>
     </w:lvlOverride>
     <w:lvlOverride w:ilvl="5">
-      <w:startOverride w:val="1"/>
+      <w:startOverride w:val="8"/>
     </w:lvlOverride>
     <w:lvlOverride w:ilvl="6">
-      <w:startOverride w:val="1"/>
+      <w:startOverride w:val="8"/>
     </w:lvlOverride>
     <w:lvlOverride w:ilvl="7">
-      <w:startOverride w:val="1"/>
+      <w:startOverride w:val="8"/>
     </w:lvlOverride>
     <w:lvlOverride w:ilvl="8">
-      <w:startOverride w:val="1"/>
-    </w:lvlOverride>
-  </w:num>
-  <w:num w:numId="1022">
-    <w:abstractNumId w:val="99411"/>
-    <w:lvlOverride w:ilvl="0">
-      <w:startOverride w:val="1"/>
-    </w:lvlOverride>
-    <w:lvlOverride w:ilvl="1">
-      <w:startOverride w:val="1"/>
-    </w:lvlOverride>
-    <w:lvlOverride w:ilvl="2">
-      <w:startOverride w:val="1"/>
-    </w:lvlOverride>
-    <w:lvlOverride w:ilvl="3">
-      <w:startOverride w:val="1"/>
-    </w:lvlOverride>
-    <w:lvlOverride w:ilvl="4">
-      <w:startOverride w:val="1"/>
-    </w:lvlOverride>
-    <w:lvlOverride w:ilvl="5">
-      <w:startOverride w:val="1"/>
-    </w:lvlOverride>
-    <w:lvlOverride w:ilvl="6">
-      <w:startOverride w:val="1"/>
-    </w:lvlOverride>
-    <w:lvlOverride w:ilvl="7">
-      <w:startOverride w:val="1"/>
-    </w:lvlOverride>
-    <w:lvlOverride w:ilvl="8">
-      <w:startOverride w:val="1"/>
-    </w:lvlOverride>
-  </w:num>
-  <w:num w:numId="1023">
-    <w:abstractNumId w:val="99431"/>
-    <w:lvlOverride w:ilvl="0">
-      <w:startOverride w:val="1"/>
-    </w:lvlOverride>
-    <w:lvlOverride w:ilvl="1">
-      <w:startOverride w:val="1"/>
-    </w:lvlOverride>
-    <w:lvlOverride w:ilvl="2">
-      <w:startOverride w:val="1"/>
-    </w:lvlOverride>
-    <w:lvlOverride w:ilvl="3">
-      <w:startOverride w:val="1"/>
-    </w:lvlOverride>
-    <w:lvlOverride w:ilvl="4">
-      <w:startOverride w:val="1"/>
-    </w:lvlOverride>
-    <w:lvlOverride w:ilvl="5">
-      <w:startOverride w:val="1"/>
-    </w:lvlOverride>
-    <w:lvlOverride w:ilvl="6">
-      <w:startOverride w:val="1"/>
-    </w:lvlOverride>
-    <w:lvlOverride w:ilvl="7">
-      <w:startOverride w:val="1"/>
-    </w:lvlOverride>
-    <w:lvlOverride w:ilvl="8">
-      <w:startOverride w:val="1"/>
-    </w:lvlOverride>
-  </w:num>
-  <w:num w:numId="1024">
-    <w:abstractNumId w:val="99431"/>
-    <w:lvlOverride w:ilvl="0">
-      <w:startOverride w:val="1"/>
-    </w:lvlOverride>
-    <w:lvlOverride w:ilvl="1">
-      <w:startOverride w:val="1"/>
-    </w:lvlOverride>
-    <w:lvlOverride w:ilvl="2">
-      <w:startOverride w:val="1"/>
-    </w:lvlOverride>
-    <w:lvlOverride w:ilvl="3">
-      <w:startOverride w:val="1"/>
-    </w:lvlOverride>
-    <w:lvlOverride w:ilvl="4">
-      <w:startOverride w:val="1"/>
-    </w:lvlOverride>
-    <w:lvlOverride w:ilvl="5">
-      <w:startOverride w:val="1"/>
-    </w:lvlOverride>
-    <w:lvlOverride w:ilvl="6">
-      <w:startOverride w:val="1"/>
-    </w:lvlOverride>
-    <w:lvlOverride w:ilvl="7">
-      <w:startOverride w:val="1"/>
-    </w:lvlOverride>
-    <w:lvlOverride w:ilvl="8">
-      <w:startOverride w:val="1"/>
+      <w:startOverride w:val="8"/>
     </w:lvlOverride>
   </w:num>
   <w:num w:numId="1025">
-    <w:abstractNumId w:val="99414"/>
+    <w:abstractNumId w:val="991"/>
+  </w:num>
+  <w:num w:numId="1026">
+    <w:abstractNumId w:val="99419"/>
     <w:lvlOverride w:ilvl="0">
-      <w:startOverride w:val="4"/>
+      <w:startOverride w:val="9"/>
     </w:lvlOverride>
     <w:lvlOverride w:ilvl="1">
-      <w:startOverride w:val="4"/>
+      <w:startOverride w:val="9"/>
     </w:lvlOverride>
     <w:lvlOverride w:ilvl="2">
-      <w:startOverride w:val="4"/>
+      <w:startOverride w:val="9"/>
     </w:lvlOverride>
     <w:lvlOverride w:ilvl="3">
-      <w:startOverride w:val="4"/>
+      <w:startOverride w:val="9"/>
     </w:lvlOverride>
     <w:lvlOverride w:ilvl="4">
-      <w:startOverride w:val="4"/>
+      <w:startOverride w:val="9"/>
     </w:lvlOverride>
     <w:lvlOverride w:ilvl="5">
-      <w:startOverride w:val="4"/>
+      <w:startOverride w:val="9"/>
     </w:lvlOverride>
     <w:lvlOverride w:ilvl="6">
-      <w:startOverride w:val="4"/>
+      <w:startOverride w:val="9"/>
     </w:lvlOverride>
     <w:lvlOverride w:ilvl="7">
-      <w:startOverride w:val="4"/>
+      <w:startOverride w:val="9"/>
     </w:lvlOverride>
     <w:lvlOverride w:ilvl="8">
-      <w:startOverride w:val="4"/>
-    </w:lvlOverride>
-  </w:num>
-  <w:num w:numId="1026">
-    <w:abstractNumId w:val="99417"/>
-    <w:lvlOverride w:ilvl="0">
-      <w:startOverride w:val="7"/>
-    </w:lvlOverride>
-    <w:lvlOverride w:ilvl="1">
-      <w:startOverride w:val="7"/>
-    </w:lvlOverride>
-    <w:lvlOverride w:ilvl="2">
-      <w:startOverride w:val="7"/>
-    </w:lvlOverride>
-    <w:lvlOverride w:ilvl="3">
-      <w:startOverride w:val="7"/>
-    </w:lvlOverride>
-    <w:lvlOverride w:ilvl="4">
-      <w:startOverride w:val="7"/>
-    </w:lvlOverride>
-    <w:lvlOverride w:ilvl="5">
-      <w:startOverride w:val="7"/>
-    </w:lvlOverride>
-    <w:lvlOverride w:ilvl="6">
-      <w:startOverride w:val="7"/>
-    </w:lvlOverride>
-    <w:lvlOverride w:ilvl="7">
-      <w:startOverride w:val="7"/>
-    </w:lvlOverride>
-    <w:lvlOverride w:ilvl="8">
-      <w:startOverride w:val="7"/>
+      <w:startOverride w:val="9"/>
     </w:lvlOverride>
   </w:num>
   <w:num w:numId="1027">
@@ -24614,6 +25087,186 @@
     </w:lvlOverride>
   </w:num>
   <w:num w:numId="1028">
+    <w:abstractNumId w:val="99411"/>
+    <w:lvlOverride w:ilvl="0">
+      <w:startOverride w:val="1"/>
+    </w:lvlOverride>
+    <w:lvlOverride w:ilvl="1">
+      <w:startOverride w:val="1"/>
+    </w:lvlOverride>
+    <w:lvlOverride w:ilvl="2">
+      <w:startOverride w:val="1"/>
+    </w:lvlOverride>
+    <w:lvlOverride w:ilvl="3">
+      <w:startOverride w:val="1"/>
+    </w:lvlOverride>
+    <w:lvlOverride w:ilvl="4">
+      <w:startOverride w:val="1"/>
+    </w:lvlOverride>
+    <w:lvlOverride w:ilvl="5">
+      <w:startOverride w:val="1"/>
+    </w:lvlOverride>
+    <w:lvlOverride w:ilvl="6">
+      <w:startOverride w:val="1"/>
+    </w:lvlOverride>
+    <w:lvlOverride w:ilvl="7">
+      <w:startOverride w:val="1"/>
+    </w:lvlOverride>
+    <w:lvlOverride w:ilvl="8">
+      <w:startOverride w:val="1"/>
+    </w:lvlOverride>
+  </w:num>
+  <w:num w:numId="1029">
+    <w:abstractNumId w:val="99431"/>
+    <w:lvlOverride w:ilvl="0">
+      <w:startOverride w:val="1"/>
+    </w:lvlOverride>
+    <w:lvlOverride w:ilvl="1">
+      <w:startOverride w:val="1"/>
+    </w:lvlOverride>
+    <w:lvlOverride w:ilvl="2">
+      <w:startOverride w:val="1"/>
+    </w:lvlOverride>
+    <w:lvlOverride w:ilvl="3">
+      <w:startOverride w:val="1"/>
+    </w:lvlOverride>
+    <w:lvlOverride w:ilvl="4">
+      <w:startOverride w:val="1"/>
+    </w:lvlOverride>
+    <w:lvlOverride w:ilvl="5">
+      <w:startOverride w:val="1"/>
+    </w:lvlOverride>
+    <w:lvlOverride w:ilvl="6">
+      <w:startOverride w:val="1"/>
+    </w:lvlOverride>
+    <w:lvlOverride w:ilvl="7">
+      <w:startOverride w:val="1"/>
+    </w:lvlOverride>
+    <w:lvlOverride w:ilvl="8">
+      <w:startOverride w:val="1"/>
+    </w:lvlOverride>
+  </w:num>
+  <w:num w:numId="1030">
+    <w:abstractNumId w:val="99431"/>
+    <w:lvlOverride w:ilvl="0">
+      <w:startOverride w:val="1"/>
+    </w:lvlOverride>
+    <w:lvlOverride w:ilvl="1">
+      <w:startOverride w:val="1"/>
+    </w:lvlOverride>
+    <w:lvlOverride w:ilvl="2">
+      <w:startOverride w:val="1"/>
+    </w:lvlOverride>
+    <w:lvlOverride w:ilvl="3">
+      <w:startOverride w:val="1"/>
+    </w:lvlOverride>
+    <w:lvlOverride w:ilvl="4">
+      <w:startOverride w:val="1"/>
+    </w:lvlOverride>
+    <w:lvlOverride w:ilvl="5">
+      <w:startOverride w:val="1"/>
+    </w:lvlOverride>
+    <w:lvlOverride w:ilvl="6">
+      <w:startOverride w:val="1"/>
+    </w:lvlOverride>
+    <w:lvlOverride w:ilvl="7">
+      <w:startOverride w:val="1"/>
+    </w:lvlOverride>
+    <w:lvlOverride w:ilvl="8">
+      <w:startOverride w:val="1"/>
+    </w:lvlOverride>
+  </w:num>
+  <w:num w:numId="1031">
+    <w:abstractNumId w:val="99414"/>
+    <w:lvlOverride w:ilvl="0">
+      <w:startOverride w:val="4"/>
+    </w:lvlOverride>
+    <w:lvlOverride w:ilvl="1">
+      <w:startOverride w:val="4"/>
+    </w:lvlOverride>
+    <w:lvlOverride w:ilvl="2">
+      <w:startOverride w:val="4"/>
+    </w:lvlOverride>
+    <w:lvlOverride w:ilvl="3">
+      <w:startOverride w:val="4"/>
+    </w:lvlOverride>
+    <w:lvlOverride w:ilvl="4">
+      <w:startOverride w:val="4"/>
+    </w:lvlOverride>
+    <w:lvlOverride w:ilvl="5">
+      <w:startOverride w:val="4"/>
+    </w:lvlOverride>
+    <w:lvlOverride w:ilvl="6">
+      <w:startOverride w:val="4"/>
+    </w:lvlOverride>
+    <w:lvlOverride w:ilvl="7">
+      <w:startOverride w:val="4"/>
+    </w:lvlOverride>
+    <w:lvlOverride w:ilvl="8">
+      <w:startOverride w:val="4"/>
+    </w:lvlOverride>
+  </w:num>
+  <w:num w:numId="1032">
+    <w:abstractNumId w:val="99417"/>
+    <w:lvlOverride w:ilvl="0">
+      <w:startOverride w:val="7"/>
+    </w:lvlOverride>
+    <w:lvlOverride w:ilvl="1">
+      <w:startOverride w:val="7"/>
+    </w:lvlOverride>
+    <w:lvlOverride w:ilvl="2">
+      <w:startOverride w:val="7"/>
+    </w:lvlOverride>
+    <w:lvlOverride w:ilvl="3">
+      <w:startOverride w:val="7"/>
+    </w:lvlOverride>
+    <w:lvlOverride w:ilvl="4">
+      <w:startOverride w:val="7"/>
+    </w:lvlOverride>
+    <w:lvlOverride w:ilvl="5">
+      <w:startOverride w:val="7"/>
+    </w:lvlOverride>
+    <w:lvlOverride w:ilvl="6">
+      <w:startOverride w:val="7"/>
+    </w:lvlOverride>
+    <w:lvlOverride w:ilvl="7">
+      <w:startOverride w:val="7"/>
+    </w:lvlOverride>
+    <w:lvlOverride w:ilvl="8">
+      <w:startOverride w:val="7"/>
+    </w:lvlOverride>
+  </w:num>
+  <w:num w:numId="1033">
+    <w:abstractNumId w:val="99431"/>
+    <w:lvlOverride w:ilvl="0">
+      <w:startOverride w:val="1"/>
+    </w:lvlOverride>
+    <w:lvlOverride w:ilvl="1">
+      <w:startOverride w:val="1"/>
+    </w:lvlOverride>
+    <w:lvlOverride w:ilvl="2">
+      <w:startOverride w:val="1"/>
+    </w:lvlOverride>
+    <w:lvlOverride w:ilvl="3">
+      <w:startOverride w:val="1"/>
+    </w:lvlOverride>
+    <w:lvlOverride w:ilvl="4">
+      <w:startOverride w:val="1"/>
+    </w:lvlOverride>
+    <w:lvlOverride w:ilvl="5">
+      <w:startOverride w:val="1"/>
+    </w:lvlOverride>
+    <w:lvlOverride w:ilvl="6">
+      <w:startOverride w:val="1"/>
+    </w:lvlOverride>
+    <w:lvlOverride w:ilvl="7">
+      <w:startOverride w:val="1"/>
+    </w:lvlOverride>
+    <w:lvlOverride w:ilvl="8">
+      <w:startOverride w:val="1"/>
+    </w:lvlOverride>
+  </w:num>
+  <w:num w:numId="1034">
     <w:abstractNumId w:val="991"/>
   </w:num>
 </w:numbering>

</xml_diff>